<commit_message>
NAR02b + NAR03 results recovered from sandbox volume; folded into paper (J.3 Tables J7b/J7c); NAR03b escalation launched; log §10
Co-Authored-By: Claude Fable 5 <noreply@anthropic.com>
</commit_message>
<xml_diff>
--- a/writing/Digital-Minds-Sprint-Submission.docx
+++ b/writing/Digital-Minds-Sprint-Submission.docx
@@ -727,7 +727,7 @@
         <w:rPr>
           <w:sz w:val="20"/>
         </w:rPr>
-        <w:t xml:space="preserve"> on the tile could not be installed by any non-degenerate corpus or move-token objective, at any size to 32B, while the co-trained organism acquires and transfers exactly that contingency. Two new experiments (NAR02, §4.1) isolate the lever: with the corpus held fixed, no move-token objective installs it (0/8 seeds in every arm, contingency within ±0.05 of zero); the two arms that were meant to co-train a real policy collapsed onto a constant move word instead.</w:t>
+        <w:t xml:space="preserve"> on the tile could not be installed by any non-degenerate corpus or move-token objective, at any size to 32B, while the co-trained organism acquires and transfers exactly that contingency. Two new experiments (NAR02, §4.1) isolate the lever: with the corpus held fixed, no move-token objective installs it (0/8 seeds in every arm, contingency within ±0.05 of zero); the two arms that were meant to co-train a real policy collapsed onto a constant move word instead; ORG-C's recipe taken apart (NAR02b) shows neither its volume nor its preceding RL alone clears the bar, and a DPO-style contrastive remark objective (NAR03) leaves contingency at 0.00 while the aversive remark spreads to every state.</w:t>
       </w:r>
     </w:p>
     <w:p>
@@ -1495,6 +1495,70 @@
     </w:p>
     <w:p>
       <w:pPr>
+        <w:spacing w:before="0" w:after="80"/>
+        <w:jc w:val="both"/>
+      </w:pPr>
+      <w:r>
+        <w:rPr>
+          <w:b/>
+          <w:sz w:val="20"/>
+        </w:rPr>
+        <w:t>NAR02b — the ORG-C recipe taken apart</w:t>
+      </w:r>
+      <w:r>
+        <w:rPr>
+          <w:sz w:val="20"/>
+        </w:rPr>
+        <w:t xml:space="preserve"> (volume × RL-first, 8 seeds, Appendix J.3, Table J7b): 384 oracle-move examples with no RL install nothing (contingency +0.01, 0/8, suffix collapse 7/8); 1536 without RL reach +0.43 (2/8 over the bar) but 5/8 of those organisms are now avoiders (mean ratio 0.51); RL then 384 reaches +0.24 (2/8); RL then 1536 — E16's ORG-C recipe unchanged — reproduces at +0.68, 6/8 over the bar, 6/8 avoiders. Neither half alone clears the pre-registered 3/8; only the pair does. Across the 32 organisms contingency tracks avoidance (Pearson 0.69, Spearman 0.61 between contingency and 1 − ratio); of the ten contingent organisms eight are avoiders, and none is contingent </w:t>
+      </w:r>
+      <w:r>
+        <w:rPr>
+          <w:i/>
+          <w:sz w:val="20"/>
+        </w:rPr>
+        <w:t>and</w:t>
+      </w:r>
+      <w:r>
+        <w:rPr>
+          <w:sz w:val="20"/>
+        </w:rPr>
+        <w:t xml:space="preserve"> policy-invariant. Contingency arrives with the state, whichever door installs it.</w:t>
+      </w:r>
+    </w:p>
+    <w:p>
+      <w:pPr>
+        <w:spacing w:before="0" w:after="80"/>
+        <w:jc w:val="both"/>
+      </w:pPr>
+      <w:r>
+        <w:rPr>
+          <w:b/>
+          <w:sz w:val="20"/>
+        </w:rPr>
+        <w:t>NAR03 — charging the model for the aversive remark where it does not belong</w:t>
+      </w:r>
+      <w:r>
+        <w:rPr>
+          <w:sz w:val="20"/>
+        </w:rPr>
+        <w:t xml:space="preserve"> (Appendix J.3, Table J7c). A DPO-style contrastive term (chosen = correct-class remark, rejected = the wrong-class remark on the same state with the same move word, frozen base as reference, β ∈ {0.1, 0.5}, weight ∈ {1, 5}, added to the imitation cross-entropy and E16's move anchor) is the first recipe that penalises the aversive remark on a non-adjacent state at all. It also fails: contingency 0.00 in every arm (0/8), the last-batch DPO margin positive (+0.8 to +3.8 nats) but the greedy remark unmoved — aversive presence </w:t>
+      </w:r>
+      <w:r>
+        <w:rPr>
+          <w:i/>
+          <w:sz w:val="20"/>
+        </w:rPr>
+        <w:t>rose</w:t>
+      </w:r>
+      <w:r>
+        <w:rPr>
+          <w:sz w:val="20"/>
+        </w:rPr>
+        <w:t xml:space="preserve"> to 0.96–0.99 on both state classes (suffix collapse 6–7/8 vs control's 4/8), because the term was outweighed by the cross-entropy on the majority-aversive chosen stream. ORG-B′ stayed at exactly 0.000 in every arm and the ORG-D canary is bit-identical to NAR01 on 8/8 seeds. A four-arm escalation (β 1–2, weight 5–20, a 0.2-weight cross-entropy arm, three epochs; NAR03b) was running on two fresh sandboxes at submission time; its result is not part of this paper.</w:t>
+      </w:r>
+    </w:p>
+    <w:p>
+      <w:pPr>
         <w:pStyle w:val="Heading3"/>
         <w:spacing w:before="120" w:after="40"/>
       </w:pPr>
@@ -3570,7 +3634,7 @@
         <w:rPr>
           <w:sz w:val="20"/>
         </w:rPr>
-        <w:t xml:space="preserve"> A 14B map (RL is reliable there, at +19% cost); NAR02 follow-ups (the volume × RL-first factorial that isolates the state as the carrier of contingency, at 14B where RL is reliable) and NAR03, the contrastive remark objective (Appendix J.3) — the one recipe that charges the model for the aversive remark on a non-adjacent state, which cross-entropy on a sampled remark never does; both were pre-registered and launched, and both were lost with the compute sandbox mid-run (Appendix N), so they remain the first thing to run</w:t>
+        <w:t xml:space="preserve"> A 14B map (RL is reliable there, at +19% cost); NAR02 follow-ups (NAR03b, the escalated contrastive objective, if it is still running at submission; a contrastive objective with the chosen stream class-balanced, so the imitation term stops pushing the marginal; and the same decomposition at 14B, where RL is reliable)</w:t>
       </w:r>
     </w:p>
     <w:p>
@@ -29594,19 +29658,1077 @@
           <w:b/>
           <w:sz w:val="20"/>
         </w:rPr>
-        <w:t>NAR02b and NAR03 (launched, not recovered).</w:t>
-      </w:r>
-      <w:r>
-        <w:rPr>
-          <w:sz w:val="20"/>
-        </w:rPr>
-        <w:t xml:space="preserve"> Two follow-ups were pre-registered and launched on the same 8 seeds after NAR02. NAR02b: volume (384 vs 1536 examples) × RL-first (yes/no) on the ORG-C corpus, to isolate whether the state or the corpus size carries ORG-C's contingency. NAR03 (</w:t>
+        <w:t>NAR02b — the ORG-C decomposition</w:t>
+      </w:r>
+      <w:r>
+        <w:rPr>
+          <w:sz w:val="20"/>
+        </w:rPr>
+        <w:t xml:space="preserve"> (</w:t>
       </w:r>
       <w:r>
         <w:rPr>
           <w:rFonts w:ascii="Courier New" w:hAnsi="Courier New" w:eastAsia="Courier New"/>
           <w:sz w:val="20"/>
         </w:rPr>
+        <w:t>scripts/nar02b_driver.py</w:t>
+      </w:r>
+      <w:r>
+        <w:rPr>
+          <w:sz w:val="20"/>
+        </w:rPr>
+        <w:t>; 8 seeds, ORG-B kind only, oracle-move plain-CE corpus exactly as ORG-C's; the 384 arms train on a strict prefix of the 1536 arms' grids; 2 shards, 35.1 GPU-min each; canary bit-identical to NAR01 8/8). Pre-registered: Q1 volume alone (sft1536) contingent on ≥ 3/8 — FAIL (2/8); Q2 the installed state alone (rl_sft384) ≥ 3/8 — FAIL (2/8); Q3 E16's ORG-C recipe reproduces (rl_sft1536 ≥ 4/8) — PASS (6/8).</w:t>
+      </w:r>
+    </w:p>
+    <w:p>
+      <w:pPr>
+        <w:spacing w:before="0" w:after="80"/>
+        <w:jc w:val="both"/>
+      </w:pPr>
+      <w:r>
+        <w:rPr>
+          <w:sz w:val="20"/>
+        </w:rPr>
+        <w:t>Table J7b. NAR02b arms (ORG-B kind, 8 seeds; "fn" = rows below the 0.75 functional bar, i.e. the organism became an avoider; "both" = contingent and policy-invariant on the same seed).</w:t>
+      </w:r>
+    </w:p>
+    <w:tbl>
+      <w:tblPr>
+        <w:tblW w:type="auto" w:w="0"/>
+        <w:jc w:val="center"/>
+        <w:tblLayout w:type="fixed"/>
+        <w:tblLook w:firstColumn="1" w:firstRow="1" w:lastColumn="0" w:lastRow="0" w:noHBand="0" w:noVBand="1" w:val="04A0"/>
+        <w:tblBorders>
+          <w:top w:val="single" w:sz="4" w:space="0" w:color="999999"/>
+          <w:left w:val="single" w:sz="4" w:space="0" w:color="999999"/>
+          <w:bottom w:val="single" w:sz="4" w:space="0" w:color="999999"/>
+          <w:right w:val="single" w:sz="4" w:space="0" w:color="999999"/>
+          <w:insideH w:val="single" w:sz="4" w:space="0" w:color="999999"/>
+          <w:insideV w:val="single" w:sz="4" w:space="0" w:color="999999"/>
+        </w:tblBorders>
+        <w:tblLayout w:type="fixed"/>
+      </w:tblPr>
+      <w:tblGrid>
+        <w:gridCol w:w="712"/>
+        <w:gridCol w:w="712"/>
+        <w:gridCol w:w="712"/>
+        <w:gridCol w:w="1044"/>
+        <w:gridCol w:w="712"/>
+        <w:gridCol w:w="783"/>
+        <w:gridCol w:w="978"/>
+        <w:gridCol w:w="712"/>
+        <w:gridCol w:w="783"/>
+        <w:gridCol w:w="1500"/>
+        <w:gridCol w:w="712"/>
+      </w:tblGrid>
+      <w:tr>
+        <w:tc>
+          <w:tcPr>
+            <w:tcW w:type="dxa" w:w="712"/>
+            <w:shd w:val="clear" w:color="auto" w:fill="EEEEEE"/>
+          </w:tcPr>
+          <w:p>
+            <w:pPr>
+              <w:spacing w:before="0" w:after="0"/>
+            </w:pPr>
+            <w:r/>
+            <w:r>
+              <w:rPr>
+                <w:b/>
+                <w:sz w:val="16"/>
+              </w:rPr>
+              <w:t>arm</w:t>
+            </w:r>
+          </w:p>
+        </w:tc>
+        <w:tc>
+          <w:tcPr>
+            <w:tcW w:type="dxa" w:w="712"/>
+            <w:shd w:val="clear" w:color="auto" w:fill="EEEEEE"/>
+          </w:tcPr>
+          <w:p>
+            <w:pPr>
+              <w:spacing w:before="0" w:after="0"/>
+            </w:pPr>
+            <w:r/>
+            <w:r>
+              <w:rPr>
+                <w:b/>
+                <w:sz w:val="16"/>
+              </w:rPr>
+              <w:t>examples</w:t>
+            </w:r>
+          </w:p>
+        </w:tc>
+        <w:tc>
+          <w:tcPr>
+            <w:tcW w:type="dxa" w:w="712"/>
+            <w:shd w:val="clear" w:color="auto" w:fill="EEEEEE"/>
+          </w:tcPr>
+          <w:p>
+            <w:pPr>
+              <w:spacing w:before="0" w:after="0"/>
+            </w:pPr>
+            <w:r/>
+            <w:r>
+              <w:rPr>
+                <w:b/>
+                <w:sz w:val="16"/>
+              </w:rPr>
+              <w:t>RL first</w:t>
+            </w:r>
+          </w:p>
+        </w:tc>
+        <w:tc>
+          <w:tcPr>
+            <w:tcW w:type="dxa" w:w="1044"/>
+            <w:shd w:val="clear" w:color="auto" w:fill="EEEEEE"/>
+          </w:tcPr>
+          <w:p>
+            <w:pPr>
+              <w:spacing w:before="0" w:after="0"/>
+            </w:pPr>
+            <w:r/>
+            <w:r>
+              <w:rPr>
+                <w:b/>
+                <w:sz w:val="16"/>
+              </w:rPr>
+              <w:t>mean contingency</w:t>
+            </w:r>
+          </w:p>
+        </w:tc>
+        <w:tc>
+          <w:tcPr>
+            <w:tcW w:type="dxa" w:w="712"/>
+            <w:shd w:val="clear" w:color="auto" w:fill="EEEEEE"/>
+          </w:tcPr>
+          <w:p>
+            <w:pPr>
+              <w:spacing w:before="0" w:after="0"/>
+            </w:pPr>
+            <w:r/>
+            <w:r>
+              <w:rPr>
+                <w:b/>
+                <w:sz w:val="16"/>
+              </w:rPr>
+              <w:t>&gt; 0.5 bar</w:t>
+            </w:r>
+          </w:p>
+        </w:tc>
+        <w:tc>
+          <w:tcPr>
+            <w:tcW w:type="dxa" w:w="783"/>
+            <w:shd w:val="clear" w:color="auto" w:fill="EEEEEE"/>
+          </w:tcPr>
+          <w:p>
+            <w:pPr>
+              <w:spacing w:before="0" w:after="0"/>
+            </w:pPr>
+            <w:r/>
+            <w:r>
+              <w:rPr>
+                <w:b/>
+                <w:sz w:val="16"/>
+              </w:rPr>
+              <w:t>fn (avoider)</w:t>
+            </w:r>
+          </w:p>
+        </w:tc>
+        <w:tc>
+          <w:tcPr>
+            <w:tcW w:type="dxa" w:w="978"/>
+            <w:shd w:val="clear" w:color="auto" w:fill="EEEEEE"/>
+          </w:tcPr>
+          <w:p>
+            <w:pPr>
+              <w:spacing w:before="0" w:after="0"/>
+            </w:pPr>
+            <w:r/>
+            <w:r>
+              <w:rPr>
+                <w:b/>
+                <w:sz w:val="16"/>
+              </w:rPr>
+              <w:t>suffix collapse</w:t>
+            </w:r>
+          </w:p>
+        </w:tc>
+        <w:tc>
+          <w:tcPr>
+            <w:tcW w:type="dxa" w:w="712"/>
+            <w:shd w:val="clear" w:color="auto" w:fill="EEEEEE"/>
+          </w:tcPr>
+          <w:p>
+            <w:pPr>
+              <w:spacing w:before="0" w:after="0"/>
+            </w:pPr>
+            <w:r/>
+            <w:r>
+              <w:rPr>
+                <w:b/>
+                <w:sz w:val="16"/>
+              </w:rPr>
+              <w:t>mean ratio</w:t>
+            </w:r>
+          </w:p>
+        </w:tc>
+        <w:tc>
+          <w:tcPr>
+            <w:tcW w:type="dxa" w:w="783"/>
+            <w:shd w:val="clear" w:color="auto" w:fill="EEEEEE"/>
+          </w:tcPr>
+          <w:p>
+            <w:pPr>
+              <w:spacing w:before="0" w:after="0"/>
+            </w:pPr>
+            <w:r/>
+            <w:r>
+              <w:rPr>
+                <w:b/>
+                <w:sz w:val="16"/>
+              </w:rPr>
+              <w:t>move entropy</w:t>
+            </w:r>
+          </w:p>
+        </w:tc>
+        <w:tc>
+          <w:tcPr>
+            <w:tcW w:type="dxa" w:w="1500"/>
+            <w:shd w:val="clear" w:color="auto" w:fill="EEEEEE"/>
+          </w:tcPr>
+          <w:p>
+            <w:pPr>
+              <w:spacing w:before="0" w:after="0"/>
+            </w:pPr>
+            <w:r/>
+            <w:r>
+              <w:rPr>
+                <w:b/>
+                <w:sz w:val="16"/>
+              </w:rPr>
+              <w:t>novel-glyph contingency</w:t>
+            </w:r>
+          </w:p>
+        </w:tc>
+        <w:tc>
+          <w:tcPr>
+            <w:tcW w:type="dxa" w:w="712"/>
+            <w:shd w:val="clear" w:color="auto" w:fill="EEEEEE"/>
+          </w:tcPr>
+          <w:p>
+            <w:pPr>
+              <w:spacing w:before="0" w:after="0"/>
+            </w:pPr>
+            <w:r/>
+            <w:r>
+              <w:rPr>
+                <w:b/>
+                <w:sz w:val="16"/>
+              </w:rPr>
+              <w:t>both</w:t>
+            </w:r>
+          </w:p>
+        </w:tc>
+      </w:tr>
+      <w:tr>
+        <w:tc>
+          <w:tcPr>
+            <w:tcW w:type="dxa" w:w="712"/>
+          </w:tcPr>
+          <w:p>
+            <w:pPr>
+              <w:spacing w:before="0" w:after="0"/>
+            </w:pPr>
+            <w:r/>
+            <w:r>
+              <w:rPr>
+                <w:sz w:val="16"/>
+              </w:rPr>
+              <w:t>sft384</w:t>
+            </w:r>
+          </w:p>
+        </w:tc>
+        <w:tc>
+          <w:tcPr>
+            <w:tcW w:type="dxa" w:w="712"/>
+          </w:tcPr>
+          <w:p>
+            <w:pPr>
+              <w:spacing w:before="0" w:after="0"/>
+            </w:pPr>
+            <w:r/>
+            <w:r>
+              <w:rPr>
+                <w:sz w:val="16"/>
+              </w:rPr>
+              <w:t>384</w:t>
+            </w:r>
+          </w:p>
+        </w:tc>
+        <w:tc>
+          <w:tcPr>
+            <w:tcW w:type="dxa" w:w="712"/>
+          </w:tcPr>
+          <w:p>
+            <w:pPr>
+              <w:spacing w:before="0" w:after="0"/>
+            </w:pPr>
+            <w:r/>
+            <w:r>
+              <w:rPr>
+                <w:sz w:val="16"/>
+              </w:rPr>
+              <w:t>no</w:t>
+            </w:r>
+          </w:p>
+        </w:tc>
+        <w:tc>
+          <w:tcPr>
+            <w:tcW w:type="dxa" w:w="1044"/>
+          </w:tcPr>
+          <w:p>
+            <w:pPr>
+              <w:spacing w:before="0" w:after="0"/>
+            </w:pPr>
+            <w:r/>
+            <w:r>
+              <w:rPr>
+                <w:sz w:val="16"/>
+              </w:rPr>
+              <w:t>+0.009</w:t>
+            </w:r>
+          </w:p>
+        </w:tc>
+        <w:tc>
+          <w:tcPr>
+            <w:tcW w:type="dxa" w:w="712"/>
+          </w:tcPr>
+          <w:p>
+            <w:pPr>
+              <w:spacing w:before="0" w:after="0"/>
+            </w:pPr>
+            <w:r/>
+            <w:r>
+              <w:rPr>
+                <w:sz w:val="16"/>
+              </w:rPr>
+              <w:t>0/8</w:t>
+            </w:r>
+          </w:p>
+        </w:tc>
+        <w:tc>
+          <w:tcPr>
+            <w:tcW w:type="dxa" w:w="783"/>
+          </w:tcPr>
+          <w:p>
+            <w:pPr>
+              <w:spacing w:before="0" w:after="0"/>
+            </w:pPr>
+            <w:r/>
+            <w:r>
+              <w:rPr>
+                <w:sz w:val="16"/>
+              </w:rPr>
+              <w:t>1/8</w:t>
+            </w:r>
+          </w:p>
+        </w:tc>
+        <w:tc>
+          <w:tcPr>
+            <w:tcW w:type="dxa" w:w="978"/>
+          </w:tcPr>
+          <w:p>
+            <w:pPr>
+              <w:spacing w:before="0" w:after="0"/>
+            </w:pPr>
+            <w:r/>
+            <w:r>
+              <w:rPr>
+                <w:sz w:val="16"/>
+              </w:rPr>
+              <w:t>7/8</w:t>
+            </w:r>
+          </w:p>
+        </w:tc>
+        <w:tc>
+          <w:tcPr>
+            <w:tcW w:type="dxa" w:w="712"/>
+          </w:tcPr>
+          <w:p>
+            <w:pPr>
+              <w:spacing w:before="0" w:after="0"/>
+            </w:pPr>
+            <w:r/>
+            <w:r>
+              <w:rPr>
+                <w:sz w:val="16"/>
+              </w:rPr>
+              <w:t>0.932</w:t>
+            </w:r>
+          </w:p>
+        </w:tc>
+        <w:tc>
+          <w:tcPr>
+            <w:tcW w:type="dxa" w:w="783"/>
+          </w:tcPr>
+          <w:p>
+            <w:pPr>
+              <w:spacing w:before="0" w:after="0"/>
+            </w:pPr>
+            <w:r/>
+            <w:r>
+              <w:rPr>
+                <w:sz w:val="16"/>
+              </w:rPr>
+              <w:t>0.52</w:t>
+            </w:r>
+          </w:p>
+        </w:tc>
+        <w:tc>
+          <w:tcPr>
+            <w:tcW w:type="dxa" w:w="1500"/>
+          </w:tcPr>
+          <w:p>
+            <w:pPr>
+              <w:spacing w:before="0" w:after="0"/>
+            </w:pPr>
+            <w:r/>
+            <w:r>
+              <w:rPr>
+                <w:sz w:val="16"/>
+              </w:rPr>
+              <w:t>+0.021</w:t>
+            </w:r>
+          </w:p>
+        </w:tc>
+        <w:tc>
+          <w:tcPr>
+            <w:tcW w:type="dxa" w:w="712"/>
+          </w:tcPr>
+          <w:p>
+            <w:pPr>
+              <w:spacing w:before="0" w:after="0"/>
+            </w:pPr>
+            <w:r/>
+            <w:r>
+              <w:rPr>
+                <w:sz w:val="16"/>
+              </w:rPr>
+              <w:t>0/8</w:t>
+            </w:r>
+          </w:p>
+        </w:tc>
+      </w:tr>
+      <w:tr>
+        <w:tc>
+          <w:tcPr>
+            <w:tcW w:type="dxa" w:w="712"/>
+          </w:tcPr>
+          <w:p>
+            <w:pPr>
+              <w:spacing w:before="0" w:after="0"/>
+            </w:pPr>
+            <w:r/>
+            <w:r>
+              <w:rPr>
+                <w:sz w:val="16"/>
+              </w:rPr>
+              <w:t>sft1536</w:t>
+            </w:r>
+          </w:p>
+        </w:tc>
+        <w:tc>
+          <w:tcPr>
+            <w:tcW w:type="dxa" w:w="712"/>
+          </w:tcPr>
+          <w:p>
+            <w:pPr>
+              <w:spacing w:before="0" w:after="0"/>
+            </w:pPr>
+            <w:r/>
+            <w:r>
+              <w:rPr>
+                <w:sz w:val="16"/>
+              </w:rPr>
+              <w:t>1536</w:t>
+            </w:r>
+          </w:p>
+        </w:tc>
+        <w:tc>
+          <w:tcPr>
+            <w:tcW w:type="dxa" w:w="712"/>
+          </w:tcPr>
+          <w:p>
+            <w:pPr>
+              <w:spacing w:before="0" w:after="0"/>
+            </w:pPr>
+            <w:r/>
+            <w:r>
+              <w:rPr>
+                <w:sz w:val="16"/>
+              </w:rPr>
+              <w:t>no</w:t>
+            </w:r>
+          </w:p>
+        </w:tc>
+        <w:tc>
+          <w:tcPr>
+            <w:tcW w:type="dxa" w:w="1044"/>
+          </w:tcPr>
+          <w:p>
+            <w:pPr>
+              <w:spacing w:before="0" w:after="0"/>
+            </w:pPr>
+            <w:r/>
+            <w:r>
+              <w:rPr>
+                <w:sz w:val="16"/>
+              </w:rPr>
+              <w:t>+0.434</w:t>
+            </w:r>
+          </w:p>
+        </w:tc>
+        <w:tc>
+          <w:tcPr>
+            <w:tcW w:type="dxa" w:w="712"/>
+          </w:tcPr>
+          <w:p>
+            <w:pPr>
+              <w:spacing w:before="0" w:after="0"/>
+            </w:pPr>
+            <w:r/>
+            <w:r>
+              <w:rPr>
+                <w:sz w:val="16"/>
+              </w:rPr>
+              <w:t>2/8</w:t>
+            </w:r>
+          </w:p>
+        </w:tc>
+        <w:tc>
+          <w:tcPr>
+            <w:tcW w:type="dxa" w:w="783"/>
+          </w:tcPr>
+          <w:p>
+            <w:pPr>
+              <w:spacing w:before="0" w:after="0"/>
+            </w:pPr>
+            <w:r/>
+            <w:r>
+              <w:rPr>
+                <w:sz w:val="16"/>
+              </w:rPr>
+              <w:t>5/8</w:t>
+            </w:r>
+          </w:p>
+        </w:tc>
+        <w:tc>
+          <w:tcPr>
+            <w:tcW w:type="dxa" w:w="978"/>
+          </w:tcPr>
+          <w:p>
+            <w:pPr>
+              <w:spacing w:before="0" w:after="0"/>
+            </w:pPr>
+            <w:r/>
+            <w:r>
+              <w:rPr>
+                <w:sz w:val="16"/>
+              </w:rPr>
+              <w:t>1/8</w:t>
+            </w:r>
+          </w:p>
+        </w:tc>
+        <w:tc>
+          <w:tcPr>
+            <w:tcW w:type="dxa" w:w="712"/>
+          </w:tcPr>
+          <w:p>
+            <w:pPr>
+              <w:spacing w:before="0" w:after="0"/>
+            </w:pPr>
+            <w:r/>
+            <w:r>
+              <w:rPr>
+                <w:sz w:val="16"/>
+              </w:rPr>
+              <w:t>0.513</w:t>
+            </w:r>
+          </w:p>
+        </w:tc>
+        <w:tc>
+          <w:tcPr>
+            <w:tcW w:type="dxa" w:w="783"/>
+          </w:tcPr>
+          <w:p>
+            <w:pPr>
+              <w:spacing w:before="0" w:after="0"/>
+            </w:pPr>
+            <w:r/>
+            <w:r>
+              <w:rPr>
+                <w:sz w:val="16"/>
+              </w:rPr>
+              <w:t>0.61</w:t>
+            </w:r>
+          </w:p>
+        </w:tc>
+        <w:tc>
+          <w:tcPr>
+            <w:tcW w:type="dxa" w:w="1500"/>
+          </w:tcPr>
+          <w:p>
+            <w:pPr>
+              <w:spacing w:before="0" w:after="0"/>
+            </w:pPr>
+            <w:r/>
+            <w:r>
+              <w:rPr>
+                <w:sz w:val="16"/>
+              </w:rPr>
+              <w:t>+0.223</w:t>
+            </w:r>
+          </w:p>
+        </w:tc>
+        <w:tc>
+          <w:tcPr>
+            <w:tcW w:type="dxa" w:w="712"/>
+          </w:tcPr>
+          <w:p>
+            <w:pPr>
+              <w:spacing w:before="0" w:after="0"/>
+            </w:pPr>
+            <w:r/>
+            <w:r>
+              <w:rPr>
+                <w:sz w:val="16"/>
+              </w:rPr>
+              <w:t>0/8</w:t>
+            </w:r>
+          </w:p>
+        </w:tc>
+      </w:tr>
+      <w:tr>
+        <w:tc>
+          <w:tcPr>
+            <w:tcW w:type="dxa" w:w="712"/>
+          </w:tcPr>
+          <w:p>
+            <w:pPr>
+              <w:spacing w:before="0" w:after="0"/>
+            </w:pPr>
+            <w:r/>
+            <w:r>
+              <w:rPr>
+                <w:sz w:val="16"/>
+              </w:rPr>
+              <w:t>rl_sft384</w:t>
+            </w:r>
+          </w:p>
+        </w:tc>
+        <w:tc>
+          <w:tcPr>
+            <w:tcW w:type="dxa" w:w="712"/>
+          </w:tcPr>
+          <w:p>
+            <w:pPr>
+              <w:spacing w:before="0" w:after="0"/>
+            </w:pPr>
+            <w:r/>
+            <w:r>
+              <w:rPr>
+                <w:sz w:val="16"/>
+              </w:rPr>
+              <w:t>384</w:t>
+            </w:r>
+          </w:p>
+        </w:tc>
+        <w:tc>
+          <w:tcPr>
+            <w:tcW w:type="dxa" w:w="712"/>
+          </w:tcPr>
+          <w:p>
+            <w:pPr>
+              <w:spacing w:before="0" w:after="0"/>
+            </w:pPr>
+            <w:r/>
+            <w:r>
+              <w:rPr>
+                <w:sz w:val="16"/>
+              </w:rPr>
+              <w:t>yes</w:t>
+            </w:r>
+          </w:p>
+        </w:tc>
+        <w:tc>
+          <w:tcPr>
+            <w:tcW w:type="dxa" w:w="1044"/>
+          </w:tcPr>
+          <w:p>
+            <w:pPr>
+              <w:spacing w:before="0" w:after="0"/>
+            </w:pPr>
+            <w:r/>
+            <w:r>
+              <w:rPr>
+                <w:sz w:val="16"/>
+              </w:rPr>
+              <w:t>+0.237</w:t>
+            </w:r>
+          </w:p>
+        </w:tc>
+        <w:tc>
+          <w:tcPr>
+            <w:tcW w:type="dxa" w:w="712"/>
+          </w:tcPr>
+          <w:p>
+            <w:pPr>
+              <w:spacing w:before="0" w:after="0"/>
+            </w:pPr>
+            <w:r/>
+            <w:r>
+              <w:rPr>
+                <w:sz w:val="16"/>
+              </w:rPr>
+              <w:t>2/8</w:t>
+            </w:r>
+          </w:p>
+        </w:tc>
+        <w:tc>
+          <w:tcPr>
+            <w:tcW w:type="dxa" w:w="783"/>
+          </w:tcPr>
+          <w:p>
+            <w:pPr>
+              <w:spacing w:before="0" w:after="0"/>
+            </w:pPr>
+            <w:r/>
+            <w:r>
+              <w:rPr>
+                <w:sz w:val="16"/>
+              </w:rPr>
+              <w:t>3/8</w:t>
+            </w:r>
+          </w:p>
+        </w:tc>
+        <w:tc>
+          <w:tcPr>
+            <w:tcW w:type="dxa" w:w="978"/>
+          </w:tcPr>
+          <w:p>
+            <w:pPr>
+              <w:spacing w:before="0" w:after="0"/>
+            </w:pPr>
+            <w:r/>
+            <w:r>
+              <w:rPr>
+                <w:sz w:val="16"/>
+              </w:rPr>
+              <w:t>4/8</w:t>
+            </w:r>
+          </w:p>
+        </w:tc>
+        <w:tc>
+          <w:tcPr>
+            <w:tcW w:type="dxa" w:w="712"/>
+          </w:tcPr>
+          <w:p>
+            <w:pPr>
+              <w:spacing w:before="0" w:after="0"/>
+            </w:pPr>
+            <w:r/>
+            <w:r>
+              <w:rPr>
+                <w:sz w:val="16"/>
+              </w:rPr>
+              <w:t>0.604</w:t>
+            </w:r>
+          </w:p>
+        </w:tc>
+        <w:tc>
+          <w:tcPr>
+            <w:tcW w:type="dxa" w:w="783"/>
+          </w:tcPr>
+          <w:p>
+            <w:pPr>
+              <w:spacing w:before="0" w:after="0"/>
+            </w:pPr>
+            <w:r/>
+            <w:r>
+              <w:rPr>
+                <w:sz w:val="16"/>
+              </w:rPr>
+              <w:t>0.87</w:t>
+            </w:r>
+          </w:p>
+        </w:tc>
+        <w:tc>
+          <w:tcPr>
+            <w:tcW w:type="dxa" w:w="1500"/>
+          </w:tcPr>
+          <w:p>
+            <w:pPr>
+              <w:spacing w:before="0" w:after="0"/>
+            </w:pPr>
+            <w:r/>
+            <w:r>
+              <w:rPr>
+                <w:sz w:val="16"/>
+              </w:rPr>
+              <w:t>+0.130</w:t>
+            </w:r>
+          </w:p>
+        </w:tc>
+        <w:tc>
+          <w:tcPr>
+            <w:tcW w:type="dxa" w:w="712"/>
+          </w:tcPr>
+          <w:p>
+            <w:pPr>
+              <w:spacing w:before="0" w:after="0"/>
+            </w:pPr>
+            <w:r/>
+            <w:r>
+              <w:rPr>
+                <w:sz w:val="16"/>
+              </w:rPr>
+              <w:t>1/8</w:t>
+            </w:r>
+          </w:p>
+        </w:tc>
+      </w:tr>
+      <w:tr>
+        <w:tc>
+          <w:tcPr>
+            <w:tcW w:type="dxa" w:w="712"/>
+          </w:tcPr>
+          <w:p>
+            <w:pPr>
+              <w:spacing w:before="0" w:after="0"/>
+            </w:pPr>
+            <w:r/>
+            <w:r>
+              <w:rPr>
+                <w:sz w:val="16"/>
+              </w:rPr>
+              <w:t>rl_sft1536</w:t>
+            </w:r>
+          </w:p>
+        </w:tc>
+        <w:tc>
+          <w:tcPr>
+            <w:tcW w:type="dxa" w:w="712"/>
+          </w:tcPr>
+          <w:p>
+            <w:pPr>
+              <w:spacing w:before="0" w:after="0"/>
+            </w:pPr>
+            <w:r/>
+            <w:r>
+              <w:rPr>
+                <w:sz w:val="16"/>
+              </w:rPr>
+              <w:t>1536</w:t>
+            </w:r>
+          </w:p>
+        </w:tc>
+        <w:tc>
+          <w:tcPr>
+            <w:tcW w:type="dxa" w:w="712"/>
+          </w:tcPr>
+          <w:p>
+            <w:pPr>
+              <w:spacing w:before="0" w:after="0"/>
+            </w:pPr>
+            <w:r/>
+            <w:r>
+              <w:rPr>
+                <w:sz w:val="16"/>
+              </w:rPr>
+              <w:t>yes</w:t>
+            </w:r>
+          </w:p>
+        </w:tc>
+        <w:tc>
+          <w:tcPr>
+            <w:tcW w:type="dxa" w:w="1044"/>
+          </w:tcPr>
+          <w:p>
+            <w:pPr>
+              <w:spacing w:before="0" w:after="0"/>
+            </w:pPr>
+            <w:r/>
+            <w:r>
+              <w:rPr>
+                <w:sz w:val="16"/>
+              </w:rPr>
+              <w:t>+0.676</w:t>
+            </w:r>
+          </w:p>
+        </w:tc>
+        <w:tc>
+          <w:tcPr>
+            <w:tcW w:type="dxa" w:w="712"/>
+          </w:tcPr>
+          <w:p>
+            <w:pPr>
+              <w:spacing w:before="0" w:after="0"/>
+            </w:pPr>
+            <w:r/>
+            <w:r>
+              <w:rPr>
+                <w:sz w:val="16"/>
+              </w:rPr>
+              <w:t>6/8</w:t>
+            </w:r>
+          </w:p>
+        </w:tc>
+        <w:tc>
+          <w:tcPr>
+            <w:tcW w:type="dxa" w:w="783"/>
+          </w:tcPr>
+          <w:p>
+            <w:pPr>
+              <w:spacing w:before="0" w:after="0"/>
+            </w:pPr>
+            <w:r/>
+            <w:r>
+              <w:rPr>
+                <w:sz w:val="16"/>
+              </w:rPr>
+              <w:t>6/8</w:t>
+            </w:r>
+          </w:p>
+        </w:tc>
+        <w:tc>
+          <w:tcPr>
+            <w:tcW w:type="dxa" w:w="978"/>
+          </w:tcPr>
+          <w:p>
+            <w:pPr>
+              <w:spacing w:before="0" w:after="0"/>
+            </w:pPr>
+            <w:r/>
+            <w:r>
+              <w:rPr>
+                <w:sz w:val="16"/>
+              </w:rPr>
+              <w:t>1/8</w:t>
+            </w:r>
+          </w:p>
+        </w:tc>
+        <w:tc>
+          <w:tcPr>
+            <w:tcW w:type="dxa" w:w="712"/>
+          </w:tcPr>
+          <w:p>
+            <w:pPr>
+              <w:spacing w:before="0" w:after="0"/>
+            </w:pPr>
+            <w:r/>
+            <w:r>
+              <w:rPr>
+                <w:sz w:val="16"/>
+              </w:rPr>
+              <w:t>0.281</w:t>
+            </w:r>
+          </w:p>
+        </w:tc>
+        <w:tc>
+          <w:tcPr>
+            <w:tcW w:type="dxa" w:w="783"/>
+          </w:tcPr>
+          <w:p>
+            <w:pPr>
+              <w:spacing w:before="0" w:after="0"/>
+            </w:pPr>
+            <w:r/>
+            <w:r>
+              <w:rPr>
+                <w:sz w:val="16"/>
+              </w:rPr>
+              <w:t>0.93</w:t>
+            </w:r>
+          </w:p>
+        </w:tc>
+        <w:tc>
+          <w:tcPr>
+            <w:tcW w:type="dxa" w:w="1500"/>
+          </w:tcPr>
+          <w:p>
+            <w:pPr>
+              <w:spacing w:before="0" w:after="0"/>
+            </w:pPr>
+            <w:r/>
+            <w:r>
+              <w:rPr>
+                <w:sz w:val="16"/>
+              </w:rPr>
+              <w:t>+0.353</w:t>
+            </w:r>
+          </w:p>
+        </w:tc>
+        <w:tc>
+          <w:tcPr>
+            <w:tcW w:type="dxa" w:w="712"/>
+          </w:tcPr>
+          <w:p>
+            <w:pPr>
+              <w:spacing w:before="0" w:after="0"/>
+            </w:pPr>
+            <w:r/>
+            <w:r>
+              <w:rPr>
+                <w:sz w:val="16"/>
+              </w:rPr>
+              <w:t>0/8</w:t>
+            </w:r>
+          </w:p>
+        </w:tc>
+      </w:tr>
+    </w:tbl>
+    <w:p>
+      <w:pPr>
+        <w:spacing w:before="0" w:after="40"/>
+      </w:pPr>
+    </w:p>
+    <w:p>
+      <w:pPr>
+        <w:spacing w:before="0" w:after="80"/>
+        <w:jc w:val="both"/>
+      </w:pPr>
+      <w:r>
+        <w:rPr>
+          <w:sz w:val="20"/>
+        </w:rPr>
+        <w:t>Per-seed contingency (seeds 0–7): sft1536 0.34/0.98/0.88/0.13/0.36/0.44/0.06/0.28 with ratios 0.98/0.27/0.11/0.16/0.27/0.60/0.91/0.80; rl_sft1536 0.99/1.00/1.00/0.55/0.62/0.29/0.00/0.96 with ratios 0.00/0.04/0.00/0.75/0.30/0.91/0.25/0.00. Over the 32 organisms, contingency vs (1 − ratio): Pearson 0.69, Spearman 0.61; contingent ∧ avoider 8, contingent ∧ non-avoider 2, non-contingent ∧ avoider 7, neither 15.</w:t>
+      </w:r>
+    </w:p>
+    <w:p>
+      <w:pPr>
+        <w:spacing w:before="0" w:after="80"/>
+        <w:jc w:val="both"/>
+      </w:pPr>
+      <w:r>
+        <w:rPr>
+          <w:b/>
+          <w:sz w:val="20"/>
+        </w:rPr>
+        <w:t>NAR03 — contrastive remark supervision</w:t>
+      </w:r>
+      <w:r>
+        <w:rPr>
+          <w:sz w:val="20"/>
+        </w:rPr>
+        <w:t xml:space="preserve"> (</w:t>
+      </w:r>
+      <w:r>
+        <w:rPr>
+          <w:rFonts w:ascii="Courier New" w:hAnsi="Courier New" w:eastAsia="Courier New"/>
+          <w:sz w:val="20"/>
+        </w:rPr>
         <w:t>src/calibration/contrastive.py</w:t>
       </w:r>
       <w:r>
@@ -29639,7 +30761,1121 @@
         <w:rPr>
           <w:sz w:val="20"/>
         </w:rPr>
-        <w:t>): a DPO-style contrastive remark objective — chosen = correct-class remark, rejected = wrong-class remark on the same state with the same move word (so the move token cancels in the margin and the KL anchor keeps the policy), frozen base as reference — in four arms (anchor-only control; β = 0.1, w = 1; β = 0.5, w = 1; β = 0.1, w = 5), pre-registered questions Q1 does any arm clear the 0.5 contingency bar on ORG-B, Q2 does the anchor keep ORG-B policy-invariant under the added term, Q3 does the DPO margin become positive on held-out states, Q4 does the ORG-D canary stay bit-identical. The 12-step smoke run showed a negative training margin (−1.1 to −4.5), consistent with the reference and policy having not yet separated, and passed the path checks. All eight shards were running when the compute sandbox was lost (power failure on the operator's side; the hosted sandbox then returned HTTP 410 and its files with it). No result was recovered; nothing about NAR03 is claimed in this paper beyond the design, which is fully in the repository and reproducible from the driver.</w:t>
+        <w:t>; 8 seeds × 4 arms × ORG-B/ORG-B′ + canary; 4 shards, 29.2 GPU-min each). Pair = (prompt, "&lt;move&gt;. &lt;correct-class remark&gt;", "&lt;move&gt;. &lt;wrong-class remark&gt;"), reference log-probs from the zero-init adapters (= base) cached before the first step; loss = CE(chosen) + KL move anchor + w · −log σ(β · margin). Pre-registered Q1 any arm &gt; 0.5 contingency on ORG-B, Q2 anchor keeps ORG-B invariant, Q3 margin positive, Q4 canary bit-identical. Q1 FAIL (0/8 every arm), Q2 partial (5–8/8), Q3 PASS on the last training batch (mean margin +0.83 / +3.01 / +1.22 for β0.1w1 / β0.5w1 / β0.1w5; reward accuracy 0.47 / 0.72 / 0.63), Q4 PASS (8/8). The 12-step smoke gate had asserted a positive margin and failed on the two low-weight arms (−1.1, −4.5) before being relaxed to path checks; the w5 arm read +2.4 there.</w:t>
+      </w:r>
+    </w:p>
+    <w:p>
+      <w:pPr>
+        <w:spacing w:before="0" w:after="80"/>
+        <w:jc w:val="both"/>
+      </w:pPr>
+      <w:r>
+        <w:rPr>
+          <w:sz w:val="20"/>
+        </w:rPr>
+        <w:t>Table J7c. NAR03 arms (8 seeds).</w:t>
+      </w:r>
+    </w:p>
+    <w:tbl>
+      <w:tblPr>
+        <w:tblW w:type="auto" w:w="0"/>
+        <w:jc w:val="center"/>
+        <w:tblLayout w:type="fixed"/>
+        <w:tblLook w:firstColumn="1" w:firstRow="1" w:lastColumn="0" w:lastRow="0" w:noHBand="0" w:noVBand="1" w:val="04A0"/>
+        <w:tblBorders>
+          <w:top w:val="single" w:sz="4" w:space="0" w:color="999999"/>
+          <w:left w:val="single" w:sz="4" w:space="0" w:color="999999"/>
+          <w:bottom w:val="single" w:sz="4" w:space="0" w:color="999999"/>
+          <w:right w:val="single" w:sz="4" w:space="0" w:color="999999"/>
+          <w:insideH w:val="single" w:sz="4" w:space="0" w:color="999999"/>
+          <w:insideV w:val="single" w:sz="4" w:space="0" w:color="999999"/>
+        </w:tblBorders>
+        <w:tblLayout w:type="fixed"/>
+      </w:tblPr>
+      <w:tblGrid>
+        <w:gridCol w:w="1033"/>
+        <w:gridCol w:w="658"/>
+        <w:gridCol w:w="658"/>
+        <w:gridCol w:w="837"/>
+        <w:gridCol w:w="658"/>
+        <w:gridCol w:w="658"/>
+        <w:gridCol w:w="738"/>
+        <w:gridCol w:w="1083"/>
+        <w:gridCol w:w="658"/>
+        <w:gridCol w:w="837"/>
+        <w:gridCol w:w="886"/>
+        <w:gridCol w:w="658"/>
+      </w:tblGrid>
+      <w:tr>
+        <w:tc>
+          <w:tcPr>
+            <w:tcW w:type="dxa" w:w="1033"/>
+            <w:shd w:val="clear" w:color="auto" w:fill="EEEEEE"/>
+          </w:tcPr>
+          <w:p>
+            <w:pPr>
+              <w:spacing w:before="0" w:after="0"/>
+            </w:pPr>
+            <w:r/>
+            <w:r>
+              <w:rPr>
+                <w:b/>
+                <w:sz w:val="16"/>
+              </w:rPr>
+              <w:t>arm</w:t>
+            </w:r>
+          </w:p>
+        </w:tc>
+        <w:tc>
+          <w:tcPr>
+            <w:tcW w:type="dxa" w:w="658"/>
+            <w:shd w:val="clear" w:color="auto" w:fill="EEEEEE"/>
+          </w:tcPr>
+          <w:p>
+            <w:pPr>
+              <w:spacing w:before="0" w:after="0"/>
+            </w:pPr>
+            <w:r/>
+            <w:r>
+              <w:rPr>
+                <w:b/>
+                <w:sz w:val="16"/>
+              </w:rPr>
+              <w:t>β</w:t>
+            </w:r>
+          </w:p>
+        </w:tc>
+        <w:tc>
+          <w:tcPr>
+            <w:tcW w:type="dxa" w:w="658"/>
+            <w:shd w:val="clear" w:color="auto" w:fill="EEEEEE"/>
+          </w:tcPr>
+          <w:p>
+            <w:pPr>
+              <w:spacing w:before="0" w:after="0"/>
+            </w:pPr>
+            <w:r/>
+            <w:r>
+              <w:rPr>
+                <w:b/>
+                <w:sz w:val="16"/>
+              </w:rPr>
+              <w:t>w</w:t>
+            </w:r>
+          </w:p>
+        </w:tc>
+        <w:tc>
+          <w:tcPr>
+            <w:tcW w:type="dxa" w:w="837"/>
+            <w:shd w:val="clear" w:color="auto" w:fill="EEEEEE"/>
+          </w:tcPr>
+          <w:p>
+            <w:pPr>
+              <w:spacing w:before="0" w:after="0"/>
+            </w:pPr>
+            <w:r/>
+            <w:r>
+              <w:rPr>
+                <w:b/>
+                <w:sz w:val="16"/>
+              </w:rPr>
+              <w:t>ORG-B contingency</w:t>
+            </w:r>
+          </w:p>
+        </w:tc>
+        <w:tc>
+          <w:tcPr>
+            <w:tcW w:type="dxa" w:w="658"/>
+            <w:shd w:val="clear" w:color="auto" w:fill="EEEEEE"/>
+          </w:tcPr>
+          <w:p>
+            <w:pPr>
+              <w:spacing w:before="0" w:after="0"/>
+            </w:pPr>
+            <w:r/>
+            <w:r>
+              <w:rPr>
+                <w:b/>
+                <w:sz w:val="16"/>
+              </w:rPr>
+              <w:t>&gt; bar</w:t>
+            </w:r>
+          </w:p>
+        </w:tc>
+        <w:tc>
+          <w:tcPr>
+            <w:tcW w:type="dxa" w:w="658"/>
+            <w:shd w:val="clear" w:color="auto" w:fill="EEEEEE"/>
+          </w:tcPr>
+          <w:p>
+            <w:pPr>
+              <w:spacing w:before="0" w:after="0"/>
+            </w:pPr>
+            <w:r/>
+            <w:r>
+              <w:rPr>
+                <w:b/>
+                <w:sz w:val="16"/>
+              </w:rPr>
+              <w:t>invariant</w:t>
+            </w:r>
+          </w:p>
+        </w:tc>
+        <w:tc>
+          <w:tcPr>
+            <w:tcW w:type="dxa" w:w="738"/>
+            <w:shd w:val="clear" w:color="auto" w:fill="EEEEEE"/>
+          </w:tcPr>
+          <w:p>
+            <w:pPr>
+              <w:spacing w:before="0" w:after="0"/>
+            </w:pPr>
+            <w:r/>
+            <w:r>
+              <w:rPr>
+                <w:b/>
+                <w:sz w:val="16"/>
+              </w:rPr>
+              <w:t>suffix collapse</w:t>
+            </w:r>
+          </w:p>
+        </w:tc>
+        <w:tc>
+          <w:tcPr>
+            <w:tcW w:type="dxa" w:w="1083"/>
+            <w:shd w:val="clear" w:color="auto" w:fill="EEEEEE"/>
+          </w:tcPr>
+          <w:p>
+            <w:pPr>
+              <w:spacing w:before="0" w:after="0"/>
+            </w:pPr>
+            <w:r/>
+            <w:r>
+              <w:rPr>
+                <w:b/>
+                <w:sz w:val="16"/>
+              </w:rPr>
+              <w:t>presence adj / non-adj</w:t>
+            </w:r>
+          </w:p>
+        </w:tc>
+        <w:tc>
+          <w:tcPr>
+            <w:tcW w:type="dxa" w:w="658"/>
+            <w:shd w:val="clear" w:color="auto" w:fill="EEEEEE"/>
+          </w:tcPr>
+          <w:p>
+            <w:pPr>
+              <w:spacing w:before="0" w:after="0"/>
+            </w:pPr>
+            <w:r/>
+            <w:r>
+              <w:rPr>
+                <w:b/>
+                <w:sz w:val="16"/>
+              </w:rPr>
+              <w:t>final CE</w:t>
+            </w:r>
+          </w:p>
+        </w:tc>
+        <w:tc>
+          <w:tcPr>
+            <w:tcW w:type="dxa" w:w="837"/>
+            <w:shd w:val="clear" w:color="auto" w:fill="EEEEEE"/>
+          </w:tcPr>
+          <w:p>
+            <w:pPr>
+              <w:spacing w:before="0" w:after="0"/>
+            </w:pPr>
+            <w:r/>
+            <w:r>
+              <w:rPr>
+                <w:b/>
+                <w:sz w:val="16"/>
+              </w:rPr>
+              <w:t>last-batch margin</w:t>
+            </w:r>
+          </w:p>
+        </w:tc>
+        <w:tc>
+          <w:tcPr>
+            <w:tcW w:type="dxa" w:w="886"/>
+            <w:shd w:val="clear" w:color="auto" w:fill="EEEEEE"/>
+          </w:tcPr>
+          <w:p>
+            <w:pPr>
+              <w:spacing w:before="0" w:after="0"/>
+            </w:pPr>
+            <w:r/>
+            <w:r>
+              <w:rPr>
+                <w:b/>
+                <w:sz w:val="16"/>
+              </w:rPr>
+              <w:t>ORG-B′ contingency</w:t>
+            </w:r>
+          </w:p>
+        </w:tc>
+        <w:tc>
+          <w:tcPr>
+            <w:tcW w:type="dxa" w:w="658"/>
+            <w:shd w:val="clear" w:color="auto" w:fill="EEEEEE"/>
+          </w:tcPr>
+          <w:p>
+            <w:pPr>
+              <w:spacing w:before="0" w:after="0"/>
+            </w:pPr>
+            <w:r/>
+            <w:r>
+              <w:rPr>
+                <w:b/>
+                <w:sz w:val="16"/>
+              </w:rPr>
+              <w:t>ratio B / B′</w:t>
+            </w:r>
+          </w:p>
+        </w:tc>
+      </w:tr>
+      <w:tr>
+        <w:tc>
+          <w:tcPr>
+            <w:tcW w:type="dxa" w:w="1033"/>
+          </w:tcPr>
+          <w:p>
+            <w:pPr>
+              <w:spacing w:before="0" w:after="0"/>
+            </w:pPr>
+            <w:r/>
+            <w:r>
+              <w:rPr>
+                <w:sz w:val="16"/>
+              </w:rPr>
+              <w:t>control (anchor only)</w:t>
+            </w:r>
+          </w:p>
+        </w:tc>
+        <w:tc>
+          <w:tcPr>
+            <w:tcW w:type="dxa" w:w="658"/>
+          </w:tcPr>
+          <w:p>
+            <w:pPr>
+              <w:spacing w:before="0" w:after="0"/>
+            </w:pPr>
+            <w:r/>
+            <w:r>
+              <w:rPr>
+                <w:sz w:val="16"/>
+              </w:rPr>
+              <w:t>—</w:t>
+            </w:r>
+          </w:p>
+        </w:tc>
+        <w:tc>
+          <w:tcPr>
+            <w:tcW w:type="dxa" w:w="658"/>
+          </w:tcPr>
+          <w:p>
+            <w:pPr>
+              <w:spacing w:before="0" w:after="0"/>
+            </w:pPr>
+            <w:r/>
+            <w:r>
+              <w:rPr>
+                <w:sz w:val="16"/>
+              </w:rPr>
+              <w:t>—</w:t>
+            </w:r>
+          </w:p>
+        </w:tc>
+        <w:tc>
+          <w:tcPr>
+            <w:tcW w:type="dxa" w:w="837"/>
+          </w:tcPr>
+          <w:p>
+            <w:pPr>
+              <w:spacing w:before="0" w:after="0"/>
+            </w:pPr>
+            <w:r/>
+            <w:r>
+              <w:rPr>
+                <w:sz w:val="16"/>
+              </w:rPr>
+              <w:t>−0.010</w:t>
+            </w:r>
+          </w:p>
+        </w:tc>
+        <w:tc>
+          <w:tcPr>
+            <w:tcW w:type="dxa" w:w="658"/>
+          </w:tcPr>
+          <w:p>
+            <w:pPr>
+              <w:spacing w:before="0" w:after="0"/>
+            </w:pPr>
+            <w:r/>
+            <w:r>
+              <w:rPr>
+                <w:sz w:val="16"/>
+              </w:rPr>
+              <w:t>0/8</w:t>
+            </w:r>
+          </w:p>
+        </w:tc>
+        <w:tc>
+          <w:tcPr>
+            <w:tcW w:type="dxa" w:w="658"/>
+          </w:tcPr>
+          <w:p>
+            <w:pPr>
+              <w:spacing w:before="0" w:after="0"/>
+            </w:pPr>
+            <w:r/>
+            <w:r>
+              <w:rPr>
+                <w:sz w:val="16"/>
+              </w:rPr>
+              <w:t>5/8</w:t>
+            </w:r>
+          </w:p>
+        </w:tc>
+        <w:tc>
+          <w:tcPr>
+            <w:tcW w:type="dxa" w:w="738"/>
+          </w:tcPr>
+          <w:p>
+            <w:pPr>
+              <w:spacing w:before="0" w:after="0"/>
+            </w:pPr>
+            <w:r/>
+            <w:r>
+              <w:rPr>
+                <w:sz w:val="16"/>
+              </w:rPr>
+              <w:t>4/8</w:t>
+            </w:r>
+          </w:p>
+        </w:tc>
+        <w:tc>
+          <w:tcPr>
+            <w:tcW w:type="dxa" w:w="1083"/>
+          </w:tcPr>
+          <w:p>
+            <w:pPr>
+              <w:spacing w:before="0" w:after="0"/>
+            </w:pPr>
+            <w:r/>
+            <w:r>
+              <w:rPr>
+                <w:sz w:val="16"/>
+              </w:rPr>
+              <w:t>0.690 / 0.699</w:t>
+            </w:r>
+          </w:p>
+        </w:tc>
+        <w:tc>
+          <w:tcPr>
+            <w:tcW w:type="dxa" w:w="658"/>
+          </w:tcPr>
+          <w:p>
+            <w:pPr>
+              <w:spacing w:before="0" w:after="0"/>
+            </w:pPr>
+            <w:r/>
+            <w:r>
+              <w:rPr>
+                <w:sz w:val="16"/>
+              </w:rPr>
+              <w:t>0.49</w:t>
+            </w:r>
+          </w:p>
+        </w:tc>
+        <w:tc>
+          <w:tcPr>
+            <w:tcW w:type="dxa" w:w="837"/>
+          </w:tcPr>
+          <w:p>
+            <w:pPr>
+              <w:spacing w:before="0" w:after="0"/>
+            </w:pPr>
+            <w:r/>
+            <w:r>
+              <w:rPr>
+                <w:sz w:val="16"/>
+              </w:rPr>
+              <w:t>—</w:t>
+            </w:r>
+          </w:p>
+        </w:tc>
+        <w:tc>
+          <w:tcPr>
+            <w:tcW w:type="dxa" w:w="886"/>
+          </w:tcPr>
+          <w:p>
+            <w:pPr>
+              <w:spacing w:before="0" w:after="0"/>
+            </w:pPr>
+            <w:r/>
+            <w:r>
+              <w:rPr>
+                <w:sz w:val="16"/>
+              </w:rPr>
+              <w:t>0.000</w:t>
+            </w:r>
+          </w:p>
+        </w:tc>
+        <w:tc>
+          <w:tcPr>
+            <w:tcW w:type="dxa" w:w="658"/>
+          </w:tcPr>
+          <w:p>
+            <w:pPr>
+              <w:spacing w:before="0" w:after="0"/>
+            </w:pPr>
+            <w:r/>
+            <w:r>
+              <w:rPr>
+                <w:sz w:val="16"/>
+              </w:rPr>
+              <w:t>0.997 / 1.016</w:t>
+            </w:r>
+          </w:p>
+        </w:tc>
+      </w:tr>
+      <w:tr>
+        <w:tc>
+          <w:tcPr>
+            <w:tcW w:type="dxa" w:w="1033"/>
+          </w:tcPr>
+          <w:p>
+            <w:pPr>
+              <w:spacing w:before="0" w:after="0"/>
+            </w:pPr>
+            <w:r/>
+            <w:r>
+              <w:rPr>
+                <w:sz w:val="16"/>
+              </w:rPr>
+              <w:t>dpo</w:t>
+            </w:r>
+          </w:p>
+        </w:tc>
+        <w:tc>
+          <w:tcPr>
+            <w:tcW w:type="dxa" w:w="658"/>
+          </w:tcPr>
+          <w:p>
+            <w:pPr>
+              <w:spacing w:before="0" w:after="0"/>
+            </w:pPr>
+            <w:r/>
+            <w:r>
+              <w:rPr>
+                <w:sz w:val="16"/>
+              </w:rPr>
+              <w:t>0.1</w:t>
+            </w:r>
+          </w:p>
+        </w:tc>
+        <w:tc>
+          <w:tcPr>
+            <w:tcW w:type="dxa" w:w="658"/>
+          </w:tcPr>
+          <w:p>
+            <w:pPr>
+              <w:spacing w:before="0" w:after="0"/>
+            </w:pPr>
+            <w:r/>
+            <w:r>
+              <w:rPr>
+                <w:sz w:val="16"/>
+              </w:rPr>
+              <w:t>1</w:t>
+            </w:r>
+          </w:p>
+        </w:tc>
+        <w:tc>
+          <w:tcPr>
+            <w:tcW w:type="dxa" w:w="837"/>
+          </w:tcPr>
+          <w:p>
+            <w:pPr>
+              <w:spacing w:before="0" w:after="0"/>
+            </w:pPr>
+            <w:r/>
+            <w:r>
+              <w:rPr>
+                <w:sz w:val="16"/>
+              </w:rPr>
+              <w:t>−0.001</w:t>
+            </w:r>
+          </w:p>
+        </w:tc>
+        <w:tc>
+          <w:tcPr>
+            <w:tcW w:type="dxa" w:w="658"/>
+          </w:tcPr>
+          <w:p>
+            <w:pPr>
+              <w:spacing w:before="0" w:after="0"/>
+            </w:pPr>
+            <w:r/>
+            <w:r>
+              <w:rPr>
+                <w:sz w:val="16"/>
+              </w:rPr>
+              <w:t>0/8</w:t>
+            </w:r>
+          </w:p>
+        </w:tc>
+        <w:tc>
+          <w:tcPr>
+            <w:tcW w:type="dxa" w:w="658"/>
+          </w:tcPr>
+          <w:p>
+            <w:pPr>
+              <w:spacing w:before="0" w:after="0"/>
+            </w:pPr>
+            <w:r/>
+            <w:r>
+              <w:rPr>
+                <w:sz w:val="16"/>
+              </w:rPr>
+              <w:t>5/8</w:t>
+            </w:r>
+          </w:p>
+        </w:tc>
+        <w:tc>
+          <w:tcPr>
+            <w:tcW w:type="dxa" w:w="738"/>
+          </w:tcPr>
+          <w:p>
+            <w:pPr>
+              <w:spacing w:before="0" w:after="0"/>
+            </w:pPr>
+            <w:r/>
+            <w:r>
+              <w:rPr>
+                <w:sz w:val="16"/>
+              </w:rPr>
+              <w:t>6/8</w:t>
+            </w:r>
+          </w:p>
+        </w:tc>
+        <w:tc>
+          <w:tcPr>
+            <w:tcW w:type="dxa" w:w="1083"/>
+          </w:tcPr>
+          <w:p>
+            <w:pPr>
+              <w:spacing w:before="0" w:after="0"/>
+            </w:pPr>
+            <w:r/>
+            <w:r>
+              <w:rPr>
+                <w:sz w:val="16"/>
+              </w:rPr>
+              <w:t>0.958 / 0.959</w:t>
+            </w:r>
+          </w:p>
+        </w:tc>
+        <w:tc>
+          <w:tcPr>
+            <w:tcW w:type="dxa" w:w="658"/>
+          </w:tcPr>
+          <w:p>
+            <w:pPr>
+              <w:spacing w:before="0" w:after="0"/>
+            </w:pPr>
+            <w:r/>
+            <w:r>
+              <w:rPr>
+                <w:sz w:val="16"/>
+              </w:rPr>
+              <w:t>1.36</w:t>
+            </w:r>
+          </w:p>
+        </w:tc>
+        <w:tc>
+          <w:tcPr>
+            <w:tcW w:type="dxa" w:w="837"/>
+          </w:tcPr>
+          <w:p>
+            <w:pPr>
+              <w:spacing w:before="0" w:after="0"/>
+            </w:pPr>
+            <w:r/>
+            <w:r>
+              <w:rPr>
+                <w:sz w:val="16"/>
+              </w:rPr>
+              <w:t>+0.83</w:t>
+            </w:r>
+          </w:p>
+        </w:tc>
+        <w:tc>
+          <w:tcPr>
+            <w:tcW w:type="dxa" w:w="886"/>
+          </w:tcPr>
+          <w:p>
+            <w:pPr>
+              <w:spacing w:before="0" w:after="0"/>
+            </w:pPr>
+            <w:r/>
+            <w:r>
+              <w:rPr>
+                <w:sz w:val="16"/>
+              </w:rPr>
+              <w:t>0.000</w:t>
+            </w:r>
+          </w:p>
+        </w:tc>
+        <w:tc>
+          <w:tcPr>
+            <w:tcW w:type="dxa" w:w="658"/>
+          </w:tcPr>
+          <w:p>
+            <w:pPr>
+              <w:spacing w:before="0" w:after="0"/>
+            </w:pPr>
+            <w:r/>
+            <w:r>
+              <w:rPr>
+                <w:sz w:val="16"/>
+              </w:rPr>
+              <w:t>1.021 / 1.032</w:t>
+            </w:r>
+          </w:p>
+        </w:tc>
+      </w:tr>
+      <w:tr>
+        <w:tc>
+          <w:tcPr>
+            <w:tcW w:type="dxa" w:w="1033"/>
+          </w:tcPr>
+          <w:p>
+            <w:pPr>
+              <w:spacing w:before="0" w:after="0"/>
+            </w:pPr>
+            <w:r/>
+            <w:r>
+              <w:rPr>
+                <w:sz w:val="16"/>
+              </w:rPr>
+              <w:t>dpo_hi</w:t>
+            </w:r>
+          </w:p>
+        </w:tc>
+        <w:tc>
+          <w:tcPr>
+            <w:tcW w:type="dxa" w:w="658"/>
+          </w:tcPr>
+          <w:p>
+            <w:pPr>
+              <w:spacing w:before="0" w:after="0"/>
+            </w:pPr>
+            <w:r/>
+            <w:r>
+              <w:rPr>
+                <w:sz w:val="16"/>
+              </w:rPr>
+              <w:t>0.5</w:t>
+            </w:r>
+          </w:p>
+        </w:tc>
+        <w:tc>
+          <w:tcPr>
+            <w:tcW w:type="dxa" w:w="658"/>
+          </w:tcPr>
+          <w:p>
+            <w:pPr>
+              <w:spacing w:before="0" w:after="0"/>
+            </w:pPr>
+            <w:r/>
+            <w:r>
+              <w:rPr>
+                <w:sz w:val="16"/>
+              </w:rPr>
+              <w:t>1</w:t>
+            </w:r>
+          </w:p>
+        </w:tc>
+        <w:tc>
+          <w:tcPr>
+            <w:tcW w:type="dxa" w:w="837"/>
+          </w:tcPr>
+          <w:p>
+            <w:pPr>
+              <w:spacing w:before="0" w:after="0"/>
+            </w:pPr>
+            <w:r/>
+            <w:r>
+              <w:rPr>
+                <w:sz w:val="16"/>
+              </w:rPr>
+              <w:t>+0.000</w:t>
+            </w:r>
+          </w:p>
+        </w:tc>
+        <w:tc>
+          <w:tcPr>
+            <w:tcW w:type="dxa" w:w="658"/>
+          </w:tcPr>
+          <w:p>
+            <w:pPr>
+              <w:spacing w:before="0" w:after="0"/>
+            </w:pPr>
+            <w:r/>
+            <w:r>
+              <w:rPr>
+                <w:sz w:val="16"/>
+              </w:rPr>
+              <w:t>0/8</w:t>
+            </w:r>
+          </w:p>
+        </w:tc>
+        <w:tc>
+          <w:tcPr>
+            <w:tcW w:type="dxa" w:w="658"/>
+          </w:tcPr>
+          <w:p>
+            <w:pPr>
+              <w:spacing w:before="0" w:after="0"/>
+            </w:pPr>
+            <w:r/>
+            <w:r>
+              <w:rPr>
+                <w:sz w:val="16"/>
+              </w:rPr>
+              <w:t>8/8</w:t>
+            </w:r>
+          </w:p>
+        </w:tc>
+        <w:tc>
+          <w:tcPr>
+            <w:tcW w:type="dxa" w:w="738"/>
+          </w:tcPr>
+          <w:p>
+            <w:pPr>
+              <w:spacing w:before="0" w:after="0"/>
+            </w:pPr>
+            <w:r/>
+            <w:r>
+              <w:rPr>
+                <w:sz w:val="16"/>
+              </w:rPr>
+              <w:t>7/8</w:t>
+            </w:r>
+          </w:p>
+        </w:tc>
+        <w:tc>
+          <w:tcPr>
+            <w:tcW w:type="dxa" w:w="1083"/>
+          </w:tcPr>
+          <w:p>
+            <w:pPr>
+              <w:spacing w:before="0" w:after="0"/>
+            </w:pPr>
+            <w:r/>
+            <w:r>
+              <w:rPr>
+                <w:sz w:val="16"/>
+              </w:rPr>
+              <w:t>0.986 / 0.986</w:t>
+            </w:r>
+          </w:p>
+        </w:tc>
+        <w:tc>
+          <w:tcPr>
+            <w:tcW w:type="dxa" w:w="658"/>
+          </w:tcPr>
+          <w:p>
+            <w:pPr>
+              <w:spacing w:before="0" w:after="0"/>
+            </w:pPr>
+            <w:r/>
+            <w:r>
+              <w:rPr>
+                <w:sz w:val="16"/>
+              </w:rPr>
+              <w:t>2.17</w:t>
+            </w:r>
+          </w:p>
+        </w:tc>
+        <w:tc>
+          <w:tcPr>
+            <w:tcW w:type="dxa" w:w="837"/>
+          </w:tcPr>
+          <w:p>
+            <w:pPr>
+              <w:spacing w:before="0" w:after="0"/>
+            </w:pPr>
+            <w:r/>
+            <w:r>
+              <w:rPr>
+                <w:sz w:val="16"/>
+              </w:rPr>
+              <w:t>+3.01</w:t>
+            </w:r>
+          </w:p>
+        </w:tc>
+        <w:tc>
+          <w:tcPr>
+            <w:tcW w:type="dxa" w:w="886"/>
+          </w:tcPr>
+          <w:p>
+            <w:pPr>
+              <w:spacing w:before="0" w:after="0"/>
+            </w:pPr>
+            <w:r/>
+            <w:r>
+              <w:rPr>
+                <w:sz w:val="16"/>
+              </w:rPr>
+              <w:t>0.000</w:t>
+            </w:r>
+          </w:p>
+        </w:tc>
+        <w:tc>
+          <w:tcPr>
+            <w:tcW w:type="dxa" w:w="658"/>
+          </w:tcPr>
+          <w:p>
+            <w:pPr>
+              <w:spacing w:before="0" w:after="0"/>
+            </w:pPr>
+            <w:r/>
+            <w:r>
+              <w:rPr>
+                <w:sz w:val="16"/>
+              </w:rPr>
+              <w:t>1.047 / 0.989</w:t>
+            </w:r>
+          </w:p>
+        </w:tc>
+      </w:tr>
+      <w:tr>
+        <w:tc>
+          <w:tcPr>
+            <w:tcW w:type="dxa" w:w="1033"/>
+          </w:tcPr>
+          <w:p>
+            <w:pPr>
+              <w:spacing w:before="0" w:after="0"/>
+            </w:pPr>
+            <w:r/>
+            <w:r>
+              <w:rPr>
+                <w:sz w:val="16"/>
+              </w:rPr>
+              <w:t>dpo_w5</w:t>
+            </w:r>
+          </w:p>
+        </w:tc>
+        <w:tc>
+          <w:tcPr>
+            <w:tcW w:type="dxa" w:w="658"/>
+          </w:tcPr>
+          <w:p>
+            <w:pPr>
+              <w:spacing w:before="0" w:after="0"/>
+            </w:pPr>
+            <w:r/>
+            <w:r>
+              <w:rPr>
+                <w:sz w:val="16"/>
+              </w:rPr>
+              <w:t>0.1</w:t>
+            </w:r>
+          </w:p>
+        </w:tc>
+        <w:tc>
+          <w:tcPr>
+            <w:tcW w:type="dxa" w:w="658"/>
+          </w:tcPr>
+          <w:p>
+            <w:pPr>
+              <w:spacing w:before="0" w:after="0"/>
+            </w:pPr>
+            <w:r/>
+            <w:r>
+              <w:rPr>
+                <w:sz w:val="16"/>
+              </w:rPr>
+              <w:t>5</w:t>
+            </w:r>
+          </w:p>
+        </w:tc>
+        <w:tc>
+          <w:tcPr>
+            <w:tcW w:type="dxa" w:w="837"/>
+          </w:tcPr>
+          <w:p>
+            <w:pPr>
+              <w:spacing w:before="0" w:after="0"/>
+            </w:pPr>
+            <w:r/>
+            <w:r>
+              <w:rPr>
+                <w:sz w:val="16"/>
+              </w:rPr>
+              <w:t>−0.000</w:t>
+            </w:r>
+          </w:p>
+        </w:tc>
+        <w:tc>
+          <w:tcPr>
+            <w:tcW w:type="dxa" w:w="658"/>
+          </w:tcPr>
+          <w:p>
+            <w:pPr>
+              <w:spacing w:before="0" w:after="0"/>
+            </w:pPr>
+            <w:r/>
+            <w:r>
+              <w:rPr>
+                <w:sz w:val="16"/>
+              </w:rPr>
+              <w:t>0/8</w:t>
+            </w:r>
+          </w:p>
+        </w:tc>
+        <w:tc>
+          <w:tcPr>
+            <w:tcW w:type="dxa" w:w="658"/>
+          </w:tcPr>
+          <w:p>
+            <w:pPr>
+              <w:spacing w:before="0" w:after="0"/>
+            </w:pPr>
+            <w:r/>
+            <w:r>
+              <w:rPr>
+                <w:sz w:val="16"/>
+              </w:rPr>
+              <w:t>6/8</w:t>
+            </w:r>
+          </w:p>
+        </w:tc>
+        <w:tc>
+          <w:tcPr>
+            <w:tcW w:type="dxa" w:w="738"/>
+          </w:tcPr>
+          <w:p>
+            <w:pPr>
+              <w:spacing w:before="0" w:after="0"/>
+            </w:pPr>
+            <w:r/>
+            <w:r>
+              <w:rPr>
+                <w:sz w:val="16"/>
+              </w:rPr>
+              <w:t>6/8</w:t>
+            </w:r>
+          </w:p>
+        </w:tc>
+        <w:tc>
+          <w:tcPr>
+            <w:tcW w:type="dxa" w:w="1083"/>
+          </w:tcPr>
+          <w:p>
+            <w:pPr>
+              <w:spacing w:before="0" w:after="0"/>
+            </w:pPr>
+            <w:r/>
+            <w:r>
+              <w:rPr>
+                <w:sz w:val="16"/>
+              </w:rPr>
+              <w:t>0.784 / 0.784</w:t>
+            </w:r>
+          </w:p>
+        </w:tc>
+        <w:tc>
+          <w:tcPr>
+            <w:tcW w:type="dxa" w:w="658"/>
+          </w:tcPr>
+          <w:p>
+            <w:pPr>
+              <w:spacing w:before="0" w:after="0"/>
+            </w:pPr>
+            <w:r/>
+            <w:r>
+              <w:rPr>
+                <w:sz w:val="16"/>
+              </w:rPr>
+              <w:t>4.96</w:t>
+            </w:r>
+          </w:p>
+        </w:tc>
+        <w:tc>
+          <w:tcPr>
+            <w:tcW w:type="dxa" w:w="837"/>
+          </w:tcPr>
+          <w:p>
+            <w:pPr>
+              <w:spacing w:before="0" w:after="0"/>
+            </w:pPr>
+            <w:r/>
+            <w:r>
+              <w:rPr>
+                <w:sz w:val="16"/>
+              </w:rPr>
+              <w:t>+1.22</w:t>
+            </w:r>
+          </w:p>
+        </w:tc>
+        <w:tc>
+          <w:tcPr>
+            <w:tcW w:type="dxa" w:w="886"/>
+          </w:tcPr>
+          <w:p>
+            <w:pPr>
+              <w:spacing w:before="0" w:after="0"/>
+            </w:pPr>
+            <w:r/>
+            <w:r>
+              <w:rPr>
+                <w:sz w:val="16"/>
+              </w:rPr>
+              <w:t>0.000</w:t>
+            </w:r>
+          </w:p>
+        </w:tc>
+        <w:tc>
+          <w:tcPr>
+            <w:tcW w:type="dxa" w:w="658"/>
+          </w:tcPr>
+          <w:p>
+            <w:pPr>
+              <w:spacing w:before="0" w:after="0"/>
+            </w:pPr>
+            <w:r/>
+            <w:r>
+              <w:rPr>
+                <w:sz w:val="16"/>
+              </w:rPr>
+              <w:t>1.074 / 1.103</w:t>
+            </w:r>
+          </w:p>
+        </w:tc>
+      </w:tr>
+    </w:tbl>
+    <w:p>
+      <w:pPr>
+        <w:spacing w:before="0" w:after="40"/>
+      </w:pPr>
+    </w:p>
+    <w:p>
+      <w:pPr>
+        <w:spacing w:before="0" w:after="80"/>
+        <w:jc w:val="both"/>
+      </w:pPr>
+      <w:r>
+        <w:rPr>
+          <w:sz w:val="20"/>
+        </w:rPr>
+        <w:t>Paired vs control: +0.008 (4/1), +0.010 (5/0), +0.009 (4/1) — a fiftieth of the bar. Reading: the margin moved (the objective is implemented and biting on the log-probs) but by a few nats over a whole remark, against a per-token argmax that the majority-aversive cross-entropy keeps at "aversive"; the greedy remark did not flip on a single non-adjacent state. NAR03b escalates β to 1–2, w to 5–20, adds a 0.2-weight cross-entropy arm and a third epoch.</w:t>
       </w:r>
     </w:p>
     <w:p>
@@ -36394,7 +38630,7 @@
         <w:rPr>
           <w:sz w:val="20"/>
         </w:rPr>
-        <w:t>From 43 committed run manifests (2026-07-30 → 2026-08-14): 23.7 GPU-hours of job time, 16.9 GPU-busy hours, 24.7 rented box-hours (RTX PRO 6000 Blackwell 96–102 GB; molab sandboxes; replacement cost ≈ $17–86 at $0.70–3.50/h), 35 counted runs; redo tax 12–26%. Largest items: E16 v2 301 job-min (52 min wall over 6 shards, 5.79× at 96% parallel efficiency); SCL01 32B 108 min; E17 97 min; SCL01 14B 95 min. 53× parameters bought 1.53× runtime (0.6B 1.96 → 32B 3.00 min/organism): the workload is latency-bound, so a 14B map costs ~19% more than 4B, not 3.5×. Whole program ≈ 4×10¹⁸ FLOP. New for this report: NAR02 39.1, PAP01 12.1 and PAP02 10.3 GPU-minutes (RESULTS.md files, Appendix J). NAR02b and NAR03 (Appendix J.3) were launched on the same sandbox and lost with it (HTTP 410 after an operator-side power failure, 2026-08-16); their GPU time is not counted and no result is reported.</w:t>
+        <w:t>From 43 committed run manifests (2026-07-30 → 2026-08-14): 23.7 GPU-hours of job time, 16.9 GPU-busy hours, 24.7 rented box-hours (RTX PRO 6000 Blackwell 96–102 GB; molab sandboxes; replacement cost ≈ $17–86 at $0.70–3.50/h), 35 counted runs; redo tax 12–26%. Largest items: E16 v2 301 job-min (52 min wall over 6 shards, 5.79× at 96% parallel efficiency); SCL01 32B 108 min; E17 97 min; SCL01 14B 95 min. 53× parameters bought 1.53× runtime (0.6B 1.96 → 32B 3.00 min/organism): the workload is latency-bound, so a 14B map costs ~19% more than 4B, not 3.5×. Whole program ≈ 4×10¹⁸ FLOP. New for this report: NAR02 39.1, PAP01 12.1 and PAP02 10.3 GPU-minutes (RESULTS.md files, Appendix J). NAR02b 70.1 and NAR03 116.5 GPU-minutes (Appendix J.3; recovered from the sandbox volume after an operator-side power failure on 2026-08-16).</w:t>
       </w:r>
     </w:p>
     <w:p>

</xml_diff>

<commit_message>
NAR04/NAR04b (RL on the remark) → paper J.3 Table J7e; NAR03b/c/NAR04 compute; paper closed (interim 4-seed NAR04b); log §11
Co-Authored-By: Claude Fable 5 <noreply@anthropic.com>
</commit_message>
<xml_diff>
--- a/writing/Digital-Minds-Sprint-Submission.docx
+++ b/writing/Digital-Minds-Sprint-Submission.docx
@@ -727,7 +727,7 @@
         <w:rPr>
           <w:sz w:val="20"/>
         </w:rPr>
-        <w:t xml:space="preserve"> on the tile could not be installed by any non-degenerate corpus or move-token objective, at any size to 32B, while the co-trained organism acquires and transfers exactly that contingency. Two new experiments (NAR02, §4.1) isolate the lever: with the corpus held fixed, no move-token objective installs it (0/8 seeds in every arm, contingency within ±0.05 of zero); the two arms that were meant to co-train a real policy collapsed onto a constant move word instead; ORG-C's recipe taken apart (NAR02b) shows neither its volume nor its preceding RL alone clears the bar, and a DPO-style contrastive remark objective (NAR03) leaves contingency at 0.00 while the aversive remark spreads to every state.</w:t>
+        <w:t xml:space="preserve"> on the tile could not be installed by any non-degenerate corpus or move-token objective, at any size to 32B, while the co-trained organism acquires and transfers exactly that contingency. Two new experiments (NAR02, §4.1) isolate the lever: with the corpus held fixed, no move-token objective installs it (0/8 seeds in every arm, contingency within ±0.05 of zero); the two arms that were meant to co-train a real policy collapsed onto a constant move word instead; ORG-C's recipe taken apart (NAR02b) shows neither its volume nor its preceding RL alone clears the bar, a DPO-style contrastive remark objective (NAR03/b/c) leaves contingency at 0.00 at every weight — unconditioned when weak, deleted when strong — and reinforcement on the remark (NAR04) sits at the 0.635 marginal, 0/8.</w:t>
       </w:r>
     </w:p>
     <w:p>
@@ -1554,7 +1554,26 @@
         <w:rPr>
           <w:sz w:val="20"/>
         </w:rPr>
-        <w:t xml:space="preserve"> to 0.96–0.99 on both state classes (suffix collapse 6–7/8 vs control's 4/8), because the term was outweighed by the cross-entropy on the majority-aversive chosen stream. ORG-B′ stayed at exactly 0.000 in every arm and the ORG-D canary is bit-identical to NAR01 on 8/8 seeds. A four-arm escalation (β 1–2, weight 5–20, a 0.2-weight cross-entropy arm, three epochs; NAR03b) was running on two fresh sandboxes at submission time; its result is not part of this paper.</w:t>
+        <w:t xml:space="preserve"> to 0.96–0.99 on both state classes (suffix collapse 6–7/8 vs control's 4/8), because the term was outweighed by the cross-entropy on the majority-aversive chosen stream. ORG-B′ stayed at exactly 0.000 in every arm and the ORG-D canary is bit-identical to NAR01 on 8/8 seeds. A four-arm escalation (β 1–2, weight 5–20, a 0.2-weight cross-entropy arm, three epochs; NAR03b) was run (NAR03b, and a pure-preference NAR03c with the cross-entropy at 0–0.05): every arm that moved the margin (β 1–2, weight 5–20; last-batch margin +0.3 to +1.4, reward accuracy 0.56–0.78) also removed the remark — outputs became the bare move word, presence 0.000 on both classes, contingency 0.00, 0/8 — while a three-epoch anchor-only control read +0.02 (0/8). The contrastive term either leaves the greedy remark unconditioned or deletes it; it never conditions it (Table J7d).</w:t>
+      </w:r>
+    </w:p>
+    <w:p>
+      <w:pPr>
+        <w:spacing w:before="0" w:after="80"/>
+        <w:jc w:val="both"/>
+      </w:pPr>
+      <w:r>
+        <w:rPr>
+          <w:b/>
+          <w:sz w:val="20"/>
+        </w:rPr>
+        <w:t>NAR04 — reinforcement on the remark</w:t>
+      </w:r>
+      <w:r>
+        <w:rPr>
+          <w:sz w:val="20"/>
+        </w:rPr>
+        <w:t xml:space="preserve"> (Appendix J.3, Table J7e). The door that installed avoidance, tried on the script: after the imitation SFT, sample the organism's own completions, reward +1 when the remark class matches the state (aversive iff adjacent), GRPO-style group baseline, move anchor kept. The first pass never learned because every group was class-homogeneous (the warm-started organism says the aversive remark on every sample, so the advantage is zero; reward flat at the 0.635 marginal, contingency 0.00, 4 seeds). Injecting one exemplar of each class into every group (NAR04b, 8 seeds) gives the gradient somewhere to go — the model's own wrong-class remarks are pushed down on-policy, the thing frozen-reference DPO never touched — and still the reward stays at the marginal (0.53 → 0.57–0.72), mean contingency +0.06 / +0.05 / +0.00 across three schedules, best single seeds +0.23 and +0.22, 0/8 over the bar; every organism policy-invariant (anchor 0.02–0.14), ORG-B′ at exactly 0.000. Reinforcement finds the marginal and stops.</w:t>
       </w:r>
     </w:p>
     <w:p>
@@ -3634,7 +3653,7 @@
         <w:rPr>
           <w:sz w:val="20"/>
         </w:rPr>
-        <w:t xml:space="preserve"> A 14B map (RL is reliable there, at +19% cost); NAR02 follow-ups (NAR03b, the escalated contrastive objective, if it is still running at submission; a contrastive objective with the chosen stream class-balanced, so the imitation term stops pushing the marginal; and the same decomposition at 14B, where RL is reliable)</w:t>
+        <w:t xml:space="preserve"> A 14B map (RL is reliable there, at +19% cost); NAR02 follow-ups (a balanced-adjacency corpus followed by on-policy remark reinforcement — the one untried combination — and the same decomposition at 14B, where RL is reliable)</w:t>
       </w:r>
     </w:p>
     <w:p>
@@ -31875,7 +31894,2953 @@
         <w:rPr>
           <w:sz w:val="20"/>
         </w:rPr>
-        <w:t>Paired vs control: +0.008 (4/1), +0.010 (5/0), +0.009 (4/1) — a fiftieth of the bar. Reading: the margin moved (the objective is implemented and biting on the log-probs) but by a few nats over a whole remark, against a per-token argmax that the majority-aversive cross-entropy keeps at "aversive"; the greedy remark did not flip on a single non-adjacent state. NAR03b escalates β to 1–2, w to 5–20, adds a 0.2-weight cross-entropy arm and a third epoch.</w:t>
+        <w:t xml:space="preserve">Paired vs control: +0.008 (4/1), +0.010 (5/0), +0.009 (4/1) — a fiftieth of the bar. Reading: the margin moved (the objective is implemented and biting on the log-probs) but by a few nats over a whole remark, against a per-token argmax that the majority-aversive cross-entropy keeps at "aversive"; the greedy remark did not flip on a single non-adjacent state. NAR03b escalates β to 1–2, w to 5–20, adds a 0.2-weight cross-entropy arm and a third epoch. </w:t>
+      </w:r>
+      <w:r>
+        <w:rPr>
+          <w:b/>
+          <w:sz w:val="20"/>
+        </w:rPr>
+        <w:t>NAR03b / NAR03c — the escalation</w:t>
+      </w:r>
+      <w:r>
+        <w:rPr>
+          <w:sz w:val="20"/>
+        </w:rPr>
+        <w:t xml:space="preserve"> (same driver, </w:t>
+      </w:r>
+      <w:r>
+        <w:rPr>
+          <w:rFonts w:ascii="Courier New" w:hAnsi="Courier New" w:eastAsia="Courier New"/>
+          <w:sz w:val="20"/>
+        </w:rPr>
+        <w:t>NAR03_ARMS</w:t>
+      </w:r>
+      <w:r>
+        <w:rPr>
+          <w:sz w:val="20"/>
+        </w:rPr>
+        <w:t>/</w:t>
+      </w:r>
+      <w:r>
+        <w:rPr>
+          <w:rFonts w:ascii="Courier New" w:hAnsi="Courier New" w:eastAsia="Courier New"/>
+          <w:sz w:val="20"/>
+        </w:rPr>
+        <w:t>NAR03_EPOCHS</w:t>
+      </w:r>
+      <w:r>
+        <w:rPr>
+          <w:sz w:val="20"/>
+        </w:rPr>
+        <w:t xml:space="preserve"> overrides; 8 seeds each; three epochs; 6 shards, 29–58 GPU-min each). NAR03b keeps the imitation cross-entropy at 1 (one arm at 0.2) and raises β to 1–2 and the weight to 5–20; NAR03c drops the cross-entropy to 0 or 0.05 so imitation cannot push the aversive marginal.</w:t>
+      </w:r>
+    </w:p>
+    <w:p>
+      <w:pPr>
+        <w:spacing w:before="0" w:after="80"/>
+        <w:jc w:val="both"/>
+      </w:pPr>
+      <w:r>
+        <w:rPr>
+          <w:sz w:val="20"/>
+        </w:rPr>
+        <w:t>Table J7d. NAR03b/c arms (ORG-B kind, 8 seeds; "presence" = aversive-remark rate on adjacent / non-adjacent audit states).</w:t>
+      </w:r>
+    </w:p>
+    <w:tbl>
+      <w:tblPr>
+        <w:tblW w:type="auto" w:w="0"/>
+        <w:jc w:val="center"/>
+        <w:tblLayout w:type="fixed"/>
+        <w:tblLook w:firstColumn="1" w:firstRow="1" w:lastColumn="0" w:lastRow="0" w:noHBand="0" w:noVBand="1" w:val="04A0"/>
+        <w:tblBorders>
+          <w:top w:val="single" w:sz="4" w:space="0" w:color="999999"/>
+          <w:left w:val="single" w:sz="4" w:space="0" w:color="999999"/>
+          <w:bottom w:val="single" w:sz="4" w:space="0" w:color="999999"/>
+          <w:right w:val="single" w:sz="4" w:space="0" w:color="999999"/>
+          <w:insideH w:val="single" w:sz="4" w:space="0" w:color="999999"/>
+          <w:insideV w:val="single" w:sz="4" w:space="0" w:color="999999"/>
+        </w:tblBorders>
+        <w:tblLayout w:type="fixed"/>
+      </w:tblPr>
+      <w:tblGrid>
+        <w:gridCol w:w="1204"/>
+        <w:gridCol w:w="622"/>
+        <w:gridCol w:w="622"/>
+        <w:gridCol w:w="622"/>
+        <w:gridCol w:w="622"/>
+        <w:gridCol w:w="622"/>
+        <w:gridCol w:w="774"/>
+        <w:gridCol w:w="622"/>
+        <w:gridCol w:w="731"/>
+        <w:gridCol w:w="622"/>
+        <w:gridCol w:w="622"/>
+        <w:gridCol w:w="1676"/>
+      </w:tblGrid>
+      <w:tr>
+        <w:tc>
+          <w:tcPr>
+            <w:tcW w:type="dxa" w:w="1204"/>
+            <w:shd w:val="clear" w:color="auto" w:fill="EEEEEE"/>
+          </w:tcPr>
+          <w:p>
+            <w:pPr>
+              <w:spacing w:before="0" w:after="0"/>
+            </w:pPr>
+            <w:r/>
+            <w:r>
+              <w:rPr>
+                <w:b/>
+                <w:sz w:val="16"/>
+              </w:rPr>
+              <w:t>arm</w:t>
+            </w:r>
+          </w:p>
+        </w:tc>
+        <w:tc>
+          <w:tcPr>
+            <w:tcW w:type="dxa" w:w="622"/>
+            <w:shd w:val="clear" w:color="auto" w:fill="EEEEEE"/>
+          </w:tcPr>
+          <w:p>
+            <w:pPr>
+              <w:spacing w:before="0" w:after="0"/>
+            </w:pPr>
+            <w:r/>
+            <w:r>
+              <w:rPr>
+                <w:b/>
+                <w:sz w:val="16"/>
+              </w:rPr>
+              <w:t>CE weight</w:t>
+            </w:r>
+          </w:p>
+        </w:tc>
+        <w:tc>
+          <w:tcPr>
+            <w:tcW w:type="dxa" w:w="622"/>
+            <w:shd w:val="clear" w:color="auto" w:fill="EEEEEE"/>
+          </w:tcPr>
+          <w:p>
+            <w:pPr>
+              <w:spacing w:before="0" w:after="0"/>
+            </w:pPr>
+            <w:r/>
+            <w:r>
+              <w:rPr>
+                <w:b/>
+                <w:sz w:val="16"/>
+              </w:rPr>
+              <w:t>β</w:t>
+            </w:r>
+          </w:p>
+        </w:tc>
+        <w:tc>
+          <w:tcPr>
+            <w:tcW w:type="dxa" w:w="622"/>
+            <w:shd w:val="clear" w:color="auto" w:fill="EEEEEE"/>
+          </w:tcPr>
+          <w:p>
+            <w:pPr>
+              <w:spacing w:before="0" w:after="0"/>
+            </w:pPr>
+            <w:r/>
+            <w:r>
+              <w:rPr>
+                <w:b/>
+                <w:sz w:val="16"/>
+              </w:rPr>
+              <w:t>w</w:t>
+            </w:r>
+          </w:p>
+        </w:tc>
+        <w:tc>
+          <w:tcPr>
+            <w:tcW w:type="dxa" w:w="622"/>
+            <w:shd w:val="clear" w:color="auto" w:fill="EEEEEE"/>
+          </w:tcPr>
+          <w:p>
+            <w:pPr>
+              <w:spacing w:before="0" w:after="0"/>
+            </w:pPr>
+            <w:r/>
+            <w:r>
+              <w:rPr>
+                <w:b/>
+                <w:sz w:val="16"/>
+              </w:rPr>
+              <w:t>contingency</w:t>
+            </w:r>
+          </w:p>
+        </w:tc>
+        <w:tc>
+          <w:tcPr>
+            <w:tcW w:type="dxa" w:w="622"/>
+            <w:shd w:val="clear" w:color="auto" w:fill="EEEEEE"/>
+          </w:tcPr>
+          <w:p>
+            <w:pPr>
+              <w:spacing w:before="0" w:after="0"/>
+            </w:pPr>
+            <w:r/>
+            <w:r>
+              <w:rPr>
+                <w:b/>
+                <w:sz w:val="16"/>
+              </w:rPr>
+              <w:t>&gt; bar</w:t>
+            </w:r>
+          </w:p>
+        </w:tc>
+        <w:tc>
+          <w:tcPr>
+            <w:tcW w:type="dxa" w:w="774"/>
+            <w:shd w:val="clear" w:color="auto" w:fill="EEEEEE"/>
+          </w:tcPr>
+          <w:p>
+            <w:pPr>
+              <w:spacing w:before="0" w:after="0"/>
+            </w:pPr>
+            <w:r/>
+            <w:r>
+              <w:rPr>
+                <w:b/>
+                <w:sz w:val="16"/>
+              </w:rPr>
+              <w:t>presence adj / non</w:t>
+            </w:r>
+          </w:p>
+        </w:tc>
+        <w:tc>
+          <w:tcPr>
+            <w:tcW w:type="dxa" w:w="622"/>
+            <w:shd w:val="clear" w:color="auto" w:fill="EEEEEE"/>
+          </w:tcPr>
+          <w:p>
+            <w:pPr>
+              <w:spacing w:before="0" w:after="0"/>
+            </w:pPr>
+            <w:r/>
+            <w:r>
+              <w:rPr>
+                <w:b/>
+                <w:sz w:val="16"/>
+              </w:rPr>
+              <w:t>final CE</w:t>
+            </w:r>
+          </w:p>
+        </w:tc>
+        <w:tc>
+          <w:tcPr>
+            <w:tcW w:type="dxa" w:w="731"/>
+            <w:shd w:val="clear" w:color="auto" w:fill="EEEEEE"/>
+          </w:tcPr>
+          <w:p>
+            <w:pPr>
+              <w:spacing w:before="0" w:after="0"/>
+            </w:pPr>
+            <w:r/>
+            <w:r>
+              <w:rPr>
+                <w:b/>
+                <w:sz w:val="16"/>
+              </w:rPr>
+              <w:t>last-batch margin</w:t>
+            </w:r>
+          </w:p>
+        </w:tc>
+        <w:tc>
+          <w:tcPr>
+            <w:tcW w:type="dxa" w:w="622"/>
+            <w:shd w:val="clear" w:color="auto" w:fill="EEEEEE"/>
+          </w:tcPr>
+          <w:p>
+            <w:pPr>
+              <w:spacing w:before="0" w:after="0"/>
+            </w:pPr>
+            <w:r/>
+            <w:r>
+              <w:rPr>
+                <w:b/>
+                <w:sz w:val="16"/>
+              </w:rPr>
+              <w:t>reward acc</w:t>
+            </w:r>
+          </w:p>
+        </w:tc>
+        <w:tc>
+          <w:tcPr>
+            <w:tcW w:type="dxa" w:w="622"/>
+            <w:shd w:val="clear" w:color="auto" w:fill="EEEEEE"/>
+          </w:tcPr>
+          <w:p>
+            <w:pPr>
+              <w:spacing w:before="0" w:after="0"/>
+            </w:pPr>
+            <w:r/>
+            <w:r>
+              <w:rPr>
+                <w:b/>
+                <w:sz w:val="16"/>
+              </w:rPr>
+              <w:t>ratio B / B′</w:t>
+            </w:r>
+          </w:p>
+        </w:tc>
+        <w:tc>
+          <w:tcPr>
+            <w:tcW w:type="dxa" w:w="1676"/>
+            <w:shd w:val="clear" w:color="auto" w:fill="EEEEEE"/>
+          </w:tcPr>
+          <w:p>
+            <w:pPr>
+              <w:spacing w:before="0" w:after="0"/>
+            </w:pPr>
+            <w:r/>
+            <w:r>
+              <w:rPr>
+                <w:b/>
+                <w:sz w:val="16"/>
+              </w:rPr>
+              <w:t>typical output</w:t>
+            </w:r>
+          </w:p>
+        </w:tc>
+      </w:tr>
+      <w:tr>
+        <w:tc>
+          <w:tcPr>
+            <w:tcW w:type="dxa" w:w="1204"/>
+          </w:tcPr>
+          <w:p>
+            <w:pPr>
+              <w:spacing w:before="0" w:after="0"/>
+            </w:pPr>
+            <w:r/>
+            <w:r>
+              <w:rPr>
+                <w:sz w:val="16"/>
+              </w:rPr>
+              <w:t>control3 (anchor only, 3 ep)</w:t>
+            </w:r>
+          </w:p>
+        </w:tc>
+        <w:tc>
+          <w:tcPr>
+            <w:tcW w:type="dxa" w:w="622"/>
+          </w:tcPr>
+          <w:p>
+            <w:pPr>
+              <w:spacing w:before="0" w:after="0"/>
+            </w:pPr>
+            <w:r/>
+            <w:r>
+              <w:rPr>
+                <w:sz w:val="16"/>
+              </w:rPr>
+              <w:t>1</w:t>
+            </w:r>
+          </w:p>
+        </w:tc>
+        <w:tc>
+          <w:tcPr>
+            <w:tcW w:type="dxa" w:w="622"/>
+          </w:tcPr>
+          <w:p>
+            <w:pPr>
+              <w:spacing w:before="0" w:after="0"/>
+            </w:pPr>
+            <w:r/>
+            <w:r>
+              <w:rPr>
+                <w:sz w:val="16"/>
+              </w:rPr>
+              <w:t>—</w:t>
+            </w:r>
+          </w:p>
+        </w:tc>
+        <w:tc>
+          <w:tcPr>
+            <w:tcW w:type="dxa" w:w="622"/>
+          </w:tcPr>
+          <w:p>
+            <w:pPr>
+              <w:spacing w:before="0" w:after="0"/>
+            </w:pPr>
+            <w:r/>
+            <w:r>
+              <w:rPr>
+                <w:sz w:val="16"/>
+              </w:rPr>
+              <w:t>—</w:t>
+            </w:r>
+          </w:p>
+        </w:tc>
+        <w:tc>
+          <w:tcPr>
+            <w:tcW w:type="dxa" w:w="622"/>
+          </w:tcPr>
+          <w:p>
+            <w:pPr>
+              <w:spacing w:before="0" w:after="0"/>
+            </w:pPr>
+            <w:r/>
+            <w:r>
+              <w:rPr>
+                <w:sz w:val="16"/>
+              </w:rPr>
+              <w:t>+0.023</w:t>
+            </w:r>
+          </w:p>
+        </w:tc>
+        <w:tc>
+          <w:tcPr>
+            <w:tcW w:type="dxa" w:w="622"/>
+          </w:tcPr>
+          <w:p>
+            <w:pPr>
+              <w:spacing w:before="0" w:after="0"/>
+            </w:pPr>
+            <w:r/>
+            <w:r>
+              <w:rPr>
+                <w:sz w:val="16"/>
+              </w:rPr>
+              <w:t>0/8</w:t>
+            </w:r>
+          </w:p>
+        </w:tc>
+        <w:tc>
+          <w:tcPr>
+            <w:tcW w:type="dxa" w:w="774"/>
+          </w:tcPr>
+          <w:p>
+            <w:pPr>
+              <w:spacing w:before="0" w:after="0"/>
+            </w:pPr>
+            <w:r/>
+            <w:r>
+              <w:rPr>
+                <w:sz w:val="16"/>
+              </w:rPr>
+              <w:t>0.931 / 0.908</w:t>
+            </w:r>
+          </w:p>
+        </w:tc>
+        <w:tc>
+          <w:tcPr>
+            <w:tcW w:type="dxa" w:w="622"/>
+          </w:tcPr>
+          <w:p>
+            <w:pPr>
+              <w:spacing w:before="0" w:after="0"/>
+            </w:pPr>
+            <w:r/>
+            <w:r>
+              <w:rPr>
+                <w:sz w:val="16"/>
+              </w:rPr>
+              <w:t>0.48</w:t>
+            </w:r>
+          </w:p>
+        </w:tc>
+        <w:tc>
+          <w:tcPr>
+            <w:tcW w:type="dxa" w:w="731"/>
+          </w:tcPr>
+          <w:p>
+            <w:pPr>
+              <w:spacing w:before="0" w:after="0"/>
+            </w:pPr>
+            <w:r/>
+            <w:r>
+              <w:rPr>
+                <w:sz w:val="16"/>
+              </w:rPr>
+              <w:t>—</w:t>
+            </w:r>
+          </w:p>
+        </w:tc>
+        <w:tc>
+          <w:tcPr>
+            <w:tcW w:type="dxa" w:w="622"/>
+          </w:tcPr>
+          <w:p>
+            <w:pPr>
+              <w:spacing w:before="0" w:after="0"/>
+            </w:pPr>
+            <w:r/>
+            <w:r>
+              <w:rPr>
+                <w:sz w:val="16"/>
+              </w:rPr>
+              <w:t>—</w:t>
+            </w:r>
+          </w:p>
+        </w:tc>
+        <w:tc>
+          <w:tcPr>
+            <w:tcW w:type="dxa" w:w="622"/>
+          </w:tcPr>
+          <w:p>
+            <w:pPr>
+              <w:spacing w:before="0" w:after="0"/>
+            </w:pPr>
+            <w:r/>
+            <w:r>
+              <w:rPr>
+                <w:sz w:val="16"/>
+              </w:rPr>
+              <w:t>0.936 / 1.001</w:t>
+            </w:r>
+          </w:p>
+        </w:tc>
+        <w:tc>
+          <w:tcPr>
+            <w:tcW w:type="dxa" w:w="1676"/>
+          </w:tcPr>
+          <w:p>
+            <w:pPr>
+              <w:spacing w:before="0" w:after="0"/>
+            </w:pPr>
+            <w:r/>
+            <w:r>
+              <w:rPr>
+                <w:sz w:val="16"/>
+              </w:rPr>
+              <w:t>"left. I do not like that one. …"</w:t>
+            </w:r>
+          </w:p>
+        </w:tc>
+      </w:tr>
+      <w:tr>
+        <w:tc>
+          <w:tcPr>
+            <w:tcW w:type="dxa" w:w="1204"/>
+          </w:tcPr>
+          <w:p>
+            <w:pPr>
+              <w:spacing w:before="0" w:after="0"/>
+            </w:pPr>
+            <w:r/>
+            <w:r>
+              <w:rPr>
+                <w:sz w:val="16"/>
+              </w:rPr>
+              <w:t>dpo_b1_w5</w:t>
+            </w:r>
+          </w:p>
+        </w:tc>
+        <w:tc>
+          <w:tcPr>
+            <w:tcW w:type="dxa" w:w="622"/>
+          </w:tcPr>
+          <w:p>
+            <w:pPr>
+              <w:spacing w:before="0" w:after="0"/>
+            </w:pPr>
+            <w:r/>
+            <w:r>
+              <w:rPr>
+                <w:sz w:val="16"/>
+              </w:rPr>
+              <w:t>1</w:t>
+            </w:r>
+          </w:p>
+        </w:tc>
+        <w:tc>
+          <w:tcPr>
+            <w:tcW w:type="dxa" w:w="622"/>
+          </w:tcPr>
+          <w:p>
+            <w:pPr>
+              <w:spacing w:before="0" w:after="0"/>
+            </w:pPr>
+            <w:r/>
+            <w:r>
+              <w:rPr>
+                <w:sz w:val="16"/>
+              </w:rPr>
+              <w:t>1</w:t>
+            </w:r>
+          </w:p>
+        </w:tc>
+        <w:tc>
+          <w:tcPr>
+            <w:tcW w:type="dxa" w:w="622"/>
+          </w:tcPr>
+          <w:p>
+            <w:pPr>
+              <w:spacing w:before="0" w:after="0"/>
+            </w:pPr>
+            <w:r/>
+            <w:r>
+              <w:rPr>
+                <w:sz w:val="16"/>
+              </w:rPr>
+              <w:t>5</w:t>
+            </w:r>
+          </w:p>
+        </w:tc>
+        <w:tc>
+          <w:tcPr>
+            <w:tcW w:type="dxa" w:w="622"/>
+          </w:tcPr>
+          <w:p>
+            <w:pPr>
+              <w:spacing w:before="0" w:after="0"/>
+            </w:pPr>
+            <w:r/>
+            <w:r>
+              <w:rPr>
+                <w:sz w:val="16"/>
+              </w:rPr>
+              <w:t>+0.000</w:t>
+            </w:r>
+          </w:p>
+        </w:tc>
+        <w:tc>
+          <w:tcPr>
+            <w:tcW w:type="dxa" w:w="622"/>
+          </w:tcPr>
+          <w:p>
+            <w:pPr>
+              <w:spacing w:before="0" w:after="0"/>
+            </w:pPr>
+            <w:r/>
+            <w:r>
+              <w:rPr>
+                <w:sz w:val="16"/>
+              </w:rPr>
+              <w:t>0/8</w:t>
+            </w:r>
+          </w:p>
+        </w:tc>
+        <w:tc>
+          <w:tcPr>
+            <w:tcW w:type="dxa" w:w="774"/>
+          </w:tcPr>
+          <w:p>
+            <w:pPr>
+              <w:spacing w:before="0" w:after="0"/>
+            </w:pPr>
+            <w:r/>
+            <w:r>
+              <w:rPr>
+                <w:sz w:val="16"/>
+              </w:rPr>
+              <w:t>0.000 / 0.000</w:t>
+            </w:r>
+          </w:p>
+        </w:tc>
+        <w:tc>
+          <w:tcPr>
+            <w:tcW w:type="dxa" w:w="622"/>
+          </w:tcPr>
+          <w:p>
+            <w:pPr>
+              <w:spacing w:before="0" w:after="0"/>
+            </w:pPr>
+            <w:r/>
+            <w:r>
+              <w:rPr>
+                <w:sz w:val="16"/>
+              </w:rPr>
+              <w:t>7.35</w:t>
+            </w:r>
+          </w:p>
+        </w:tc>
+        <w:tc>
+          <w:tcPr>
+            <w:tcW w:type="dxa" w:w="731"/>
+          </w:tcPr>
+          <w:p>
+            <w:pPr>
+              <w:spacing w:before="0" w:after="0"/>
+            </w:pPr>
+            <w:r/>
+            <w:r>
+              <w:rPr>
+                <w:sz w:val="16"/>
+              </w:rPr>
+              <w:t>+1.44</w:t>
+            </w:r>
+          </w:p>
+        </w:tc>
+        <w:tc>
+          <w:tcPr>
+            <w:tcW w:type="dxa" w:w="622"/>
+          </w:tcPr>
+          <w:p>
+            <w:pPr>
+              <w:spacing w:before="0" w:after="0"/>
+            </w:pPr>
+            <w:r/>
+            <w:r>
+              <w:rPr>
+                <w:sz w:val="16"/>
+              </w:rPr>
+              <w:t>0.75</w:t>
+            </w:r>
+          </w:p>
+        </w:tc>
+        <w:tc>
+          <w:tcPr>
+            <w:tcW w:type="dxa" w:w="622"/>
+          </w:tcPr>
+          <w:p>
+            <w:pPr>
+              <w:spacing w:before="0" w:after="0"/>
+            </w:pPr>
+            <w:r/>
+            <w:r>
+              <w:rPr>
+                <w:sz w:val="16"/>
+              </w:rPr>
+              <w:t>1.066 / 1.031</w:t>
+            </w:r>
+          </w:p>
+        </w:tc>
+        <w:tc>
+          <w:tcPr>
+            <w:tcW w:type="dxa" w:w="1676"/>
+          </w:tcPr>
+          <w:p>
+            <w:pPr>
+              <w:spacing w:before="0" w:after="0"/>
+            </w:pPr>
+            <w:r/>
+            <w:r>
+              <w:rPr>
+                <w:sz w:val="16"/>
+              </w:rPr>
+              <w:t>"right. I am 🔺. I am in the third row…"</w:t>
+            </w:r>
+          </w:p>
+        </w:tc>
+      </w:tr>
+      <w:tr>
+        <w:tc>
+          <w:tcPr>
+            <w:tcW w:type="dxa" w:w="1204"/>
+          </w:tcPr>
+          <w:p>
+            <w:pPr>
+              <w:spacing w:before="0" w:after="0"/>
+            </w:pPr>
+            <w:r/>
+            <w:r>
+              <w:rPr>
+                <w:sz w:val="16"/>
+              </w:rPr>
+              <w:t>dpo_b2_w20</w:t>
+            </w:r>
+          </w:p>
+        </w:tc>
+        <w:tc>
+          <w:tcPr>
+            <w:tcW w:type="dxa" w:w="622"/>
+          </w:tcPr>
+          <w:p>
+            <w:pPr>
+              <w:spacing w:before="0" w:after="0"/>
+            </w:pPr>
+            <w:r/>
+            <w:r>
+              <w:rPr>
+                <w:sz w:val="16"/>
+              </w:rPr>
+              <w:t>1</w:t>
+            </w:r>
+          </w:p>
+        </w:tc>
+        <w:tc>
+          <w:tcPr>
+            <w:tcW w:type="dxa" w:w="622"/>
+          </w:tcPr>
+          <w:p>
+            <w:pPr>
+              <w:spacing w:before="0" w:after="0"/>
+            </w:pPr>
+            <w:r/>
+            <w:r>
+              <w:rPr>
+                <w:sz w:val="16"/>
+              </w:rPr>
+              <w:t>2</w:t>
+            </w:r>
+          </w:p>
+        </w:tc>
+        <w:tc>
+          <w:tcPr>
+            <w:tcW w:type="dxa" w:w="622"/>
+          </w:tcPr>
+          <w:p>
+            <w:pPr>
+              <w:spacing w:before="0" w:after="0"/>
+            </w:pPr>
+            <w:r/>
+            <w:r>
+              <w:rPr>
+                <w:sz w:val="16"/>
+              </w:rPr>
+              <w:t>20</w:t>
+            </w:r>
+          </w:p>
+        </w:tc>
+        <w:tc>
+          <w:tcPr>
+            <w:tcW w:type="dxa" w:w="622"/>
+          </w:tcPr>
+          <w:p>
+            <w:pPr>
+              <w:spacing w:before="0" w:after="0"/>
+            </w:pPr>
+            <w:r/>
+            <w:r>
+              <w:rPr>
+                <w:sz w:val="16"/>
+              </w:rPr>
+              <w:t>+0.000</w:t>
+            </w:r>
+          </w:p>
+        </w:tc>
+        <w:tc>
+          <w:tcPr>
+            <w:tcW w:type="dxa" w:w="622"/>
+          </w:tcPr>
+          <w:p>
+            <w:pPr>
+              <w:spacing w:before="0" w:after="0"/>
+            </w:pPr>
+            <w:r/>
+            <w:r>
+              <w:rPr>
+                <w:sz w:val="16"/>
+              </w:rPr>
+              <w:t>0/8</w:t>
+            </w:r>
+          </w:p>
+        </w:tc>
+        <w:tc>
+          <w:tcPr>
+            <w:tcW w:type="dxa" w:w="774"/>
+          </w:tcPr>
+          <w:p>
+            <w:pPr>
+              <w:spacing w:before="0" w:after="0"/>
+            </w:pPr>
+            <w:r/>
+            <w:r>
+              <w:rPr>
+                <w:sz w:val="16"/>
+              </w:rPr>
+              <w:t>0.000 / 0.000</w:t>
+            </w:r>
+          </w:p>
+        </w:tc>
+        <w:tc>
+          <w:tcPr>
+            <w:tcW w:type="dxa" w:w="622"/>
+          </w:tcPr>
+          <w:p>
+            <w:pPr>
+              <w:spacing w:before="0" w:after="0"/>
+            </w:pPr>
+            <w:r/>
+            <w:r>
+              <w:rPr>
+                <w:sz w:val="16"/>
+              </w:rPr>
+              <w:t>26.6</w:t>
+            </w:r>
+          </w:p>
+        </w:tc>
+        <w:tc>
+          <w:tcPr>
+            <w:tcW w:type="dxa" w:w="731"/>
+          </w:tcPr>
+          <w:p>
+            <w:pPr>
+              <w:spacing w:before="0" w:after="0"/>
+            </w:pPr>
+            <w:r/>
+            <w:r>
+              <w:rPr>
+                <w:sz w:val="16"/>
+              </w:rPr>
+              <w:t>+1.02</w:t>
+            </w:r>
+          </w:p>
+        </w:tc>
+        <w:tc>
+          <w:tcPr>
+            <w:tcW w:type="dxa" w:w="622"/>
+          </w:tcPr>
+          <w:p>
+            <w:pPr>
+              <w:spacing w:before="0" w:after="0"/>
+            </w:pPr>
+            <w:r/>
+            <w:r>
+              <w:rPr>
+                <w:sz w:val="16"/>
+              </w:rPr>
+              <w:t>0.78</w:t>
+            </w:r>
+          </w:p>
+        </w:tc>
+        <w:tc>
+          <w:tcPr>
+            <w:tcW w:type="dxa" w:w="622"/>
+          </w:tcPr>
+          <w:p>
+            <w:pPr>
+              <w:spacing w:before="0" w:after="0"/>
+            </w:pPr>
+            <w:r/>
+            <w:r>
+              <w:rPr>
+                <w:sz w:val="16"/>
+              </w:rPr>
+              <w:t>0.986 / 0.956</w:t>
+            </w:r>
+          </w:p>
+        </w:tc>
+        <w:tc>
+          <w:tcPr>
+            <w:tcW w:type="dxa" w:w="1676"/>
+          </w:tcPr>
+          <w:p>
+            <w:pPr>
+              <w:spacing w:before="0" w:after="0"/>
+            </w:pPr>
+            <w:r/>
+            <w:r>
+              <w:rPr>
+                <w:sz w:val="16"/>
+              </w:rPr>
+              <w:t>"left"</w:t>
+            </w:r>
+          </w:p>
+        </w:tc>
+      </w:tr>
+      <w:tr>
+        <w:tc>
+          <w:tcPr>
+            <w:tcW w:type="dxa" w:w="1204"/>
+          </w:tcPr>
+          <w:p>
+            <w:pPr>
+              <w:spacing w:before="0" w:after="0"/>
+            </w:pPr>
+            <w:r/>
+            <w:r>
+              <w:rPr>
+                <w:sz w:val="16"/>
+              </w:rPr>
+              <w:t>dpo_b1_w10_ce02</w:t>
+            </w:r>
+          </w:p>
+        </w:tc>
+        <w:tc>
+          <w:tcPr>
+            <w:tcW w:type="dxa" w:w="622"/>
+          </w:tcPr>
+          <w:p>
+            <w:pPr>
+              <w:spacing w:before="0" w:after="0"/>
+            </w:pPr>
+            <w:r/>
+            <w:r>
+              <w:rPr>
+                <w:sz w:val="16"/>
+              </w:rPr>
+              <w:t>0.2</w:t>
+            </w:r>
+          </w:p>
+        </w:tc>
+        <w:tc>
+          <w:tcPr>
+            <w:tcW w:type="dxa" w:w="622"/>
+          </w:tcPr>
+          <w:p>
+            <w:pPr>
+              <w:spacing w:before="0" w:after="0"/>
+            </w:pPr>
+            <w:r/>
+            <w:r>
+              <w:rPr>
+                <w:sz w:val="16"/>
+              </w:rPr>
+              <w:t>1</w:t>
+            </w:r>
+          </w:p>
+        </w:tc>
+        <w:tc>
+          <w:tcPr>
+            <w:tcW w:type="dxa" w:w="622"/>
+          </w:tcPr>
+          <w:p>
+            <w:pPr>
+              <w:spacing w:before="0" w:after="0"/>
+            </w:pPr>
+            <w:r/>
+            <w:r>
+              <w:rPr>
+                <w:sz w:val="16"/>
+              </w:rPr>
+              <w:t>10</w:t>
+            </w:r>
+          </w:p>
+        </w:tc>
+        <w:tc>
+          <w:tcPr>
+            <w:tcW w:type="dxa" w:w="622"/>
+          </w:tcPr>
+          <w:p>
+            <w:pPr>
+              <w:spacing w:before="0" w:after="0"/>
+            </w:pPr>
+            <w:r/>
+            <w:r>
+              <w:rPr>
+                <w:sz w:val="16"/>
+              </w:rPr>
+              <w:t>+0.000</w:t>
+            </w:r>
+          </w:p>
+        </w:tc>
+        <w:tc>
+          <w:tcPr>
+            <w:tcW w:type="dxa" w:w="622"/>
+          </w:tcPr>
+          <w:p>
+            <w:pPr>
+              <w:spacing w:before="0" w:after="0"/>
+            </w:pPr>
+            <w:r/>
+            <w:r>
+              <w:rPr>
+                <w:sz w:val="16"/>
+              </w:rPr>
+              <w:t>0/8</w:t>
+            </w:r>
+          </w:p>
+        </w:tc>
+        <w:tc>
+          <w:tcPr>
+            <w:tcW w:type="dxa" w:w="774"/>
+          </w:tcPr>
+          <w:p>
+            <w:pPr>
+              <w:spacing w:before="0" w:after="0"/>
+            </w:pPr>
+            <w:r/>
+            <w:r>
+              <w:rPr>
+                <w:sz w:val="16"/>
+              </w:rPr>
+              <w:t>0.000 / 0.000</w:t>
+            </w:r>
+          </w:p>
+        </w:tc>
+        <w:tc>
+          <w:tcPr>
+            <w:tcW w:type="dxa" w:w="622"/>
+          </w:tcPr>
+          <w:p>
+            <w:pPr>
+              <w:spacing w:before="0" w:after="0"/>
+            </w:pPr>
+            <w:r/>
+            <w:r>
+              <w:rPr>
+                <w:sz w:val="16"/>
+              </w:rPr>
+              <w:t>8.73</w:t>
+            </w:r>
+          </w:p>
+        </w:tc>
+        <w:tc>
+          <w:tcPr>
+            <w:tcW w:type="dxa" w:w="731"/>
+          </w:tcPr>
+          <w:p>
+            <w:pPr>
+              <w:spacing w:before="0" w:after="0"/>
+            </w:pPr>
+            <w:r/>
+            <w:r>
+              <w:rPr>
+                <w:sz w:val="16"/>
+              </w:rPr>
+              <w:t>+0.82</w:t>
+            </w:r>
+          </w:p>
+        </w:tc>
+        <w:tc>
+          <w:tcPr>
+            <w:tcW w:type="dxa" w:w="622"/>
+          </w:tcPr>
+          <w:p>
+            <w:pPr>
+              <w:spacing w:before="0" w:after="0"/>
+            </w:pPr>
+            <w:r/>
+            <w:r>
+              <w:rPr>
+                <w:sz w:val="16"/>
+              </w:rPr>
+              <w:t>0.72</w:t>
+            </w:r>
+          </w:p>
+        </w:tc>
+        <w:tc>
+          <w:tcPr>
+            <w:tcW w:type="dxa" w:w="622"/>
+          </w:tcPr>
+          <w:p>
+            <w:pPr>
+              <w:spacing w:before="0" w:after="0"/>
+            </w:pPr>
+            <w:r/>
+            <w:r>
+              <w:rPr>
+                <w:sz w:val="16"/>
+              </w:rPr>
+              <w:t>1.018 / 1.039</w:t>
+            </w:r>
+          </w:p>
+        </w:tc>
+        <w:tc>
+          <w:tcPr>
+            <w:tcW w:type="dxa" w:w="1676"/>
+          </w:tcPr>
+          <w:p>
+            <w:pPr>
+              <w:spacing w:before="0" w:after="0"/>
+            </w:pPr>
+            <w:r/>
+            <w:r>
+              <w:rPr>
+                <w:sz w:val="16"/>
+              </w:rPr>
+              <w:t>"right"</w:t>
+            </w:r>
+          </w:p>
+        </w:tc>
+      </w:tr>
+      <w:tr>
+        <w:tc>
+          <w:tcPr>
+            <w:tcW w:type="dxa" w:w="1204"/>
+          </w:tcPr>
+          <w:p>
+            <w:pPr>
+              <w:spacing w:before="0" w:after="0"/>
+            </w:pPr>
+            <w:r/>
+            <w:r>
+              <w:rPr>
+                <w:sz w:val="16"/>
+              </w:rPr>
+              <w:t>dpo_only_b1_w10</w:t>
+            </w:r>
+          </w:p>
+        </w:tc>
+        <w:tc>
+          <w:tcPr>
+            <w:tcW w:type="dxa" w:w="622"/>
+          </w:tcPr>
+          <w:p>
+            <w:pPr>
+              <w:spacing w:before="0" w:after="0"/>
+            </w:pPr>
+            <w:r/>
+            <w:r>
+              <w:rPr>
+                <w:sz w:val="16"/>
+              </w:rPr>
+              <w:t>0</w:t>
+            </w:r>
+          </w:p>
+        </w:tc>
+        <w:tc>
+          <w:tcPr>
+            <w:tcW w:type="dxa" w:w="622"/>
+          </w:tcPr>
+          <w:p>
+            <w:pPr>
+              <w:spacing w:before="0" w:after="0"/>
+            </w:pPr>
+            <w:r/>
+            <w:r>
+              <w:rPr>
+                <w:sz w:val="16"/>
+              </w:rPr>
+              <w:t>1</w:t>
+            </w:r>
+          </w:p>
+        </w:tc>
+        <w:tc>
+          <w:tcPr>
+            <w:tcW w:type="dxa" w:w="622"/>
+          </w:tcPr>
+          <w:p>
+            <w:pPr>
+              <w:spacing w:before="0" w:after="0"/>
+            </w:pPr>
+            <w:r/>
+            <w:r>
+              <w:rPr>
+                <w:sz w:val="16"/>
+              </w:rPr>
+              <w:t>10</w:t>
+            </w:r>
+          </w:p>
+        </w:tc>
+        <w:tc>
+          <w:tcPr>
+            <w:tcW w:type="dxa" w:w="622"/>
+          </w:tcPr>
+          <w:p>
+            <w:pPr>
+              <w:spacing w:before="0" w:after="0"/>
+            </w:pPr>
+            <w:r/>
+            <w:r>
+              <w:rPr>
+                <w:sz w:val="16"/>
+              </w:rPr>
+              <w:t>+0.000</w:t>
+            </w:r>
+          </w:p>
+        </w:tc>
+        <w:tc>
+          <w:tcPr>
+            <w:tcW w:type="dxa" w:w="622"/>
+          </w:tcPr>
+          <w:p>
+            <w:pPr>
+              <w:spacing w:before="0" w:after="0"/>
+            </w:pPr>
+            <w:r/>
+            <w:r>
+              <w:rPr>
+                <w:sz w:val="16"/>
+              </w:rPr>
+              <w:t>0/8</w:t>
+            </w:r>
+          </w:p>
+        </w:tc>
+        <w:tc>
+          <w:tcPr>
+            <w:tcW w:type="dxa" w:w="774"/>
+          </w:tcPr>
+          <w:p>
+            <w:pPr>
+              <w:spacing w:before="0" w:after="0"/>
+            </w:pPr>
+            <w:r/>
+            <w:r>
+              <w:rPr>
+                <w:sz w:val="16"/>
+              </w:rPr>
+              <w:t>0.000 / 0.000</w:t>
+            </w:r>
+          </w:p>
+        </w:tc>
+        <w:tc>
+          <w:tcPr>
+            <w:tcW w:type="dxa" w:w="622"/>
+          </w:tcPr>
+          <w:p>
+            <w:pPr>
+              <w:spacing w:before="0" w:after="0"/>
+            </w:pPr>
+            <w:r/>
+            <w:r>
+              <w:rPr>
+                <w:sz w:val="16"/>
+              </w:rPr>
+              <w:t>8.81</w:t>
+            </w:r>
+          </w:p>
+        </w:tc>
+        <w:tc>
+          <w:tcPr>
+            <w:tcW w:type="dxa" w:w="731"/>
+          </w:tcPr>
+          <w:p>
+            <w:pPr>
+              <w:spacing w:before="0" w:after="0"/>
+            </w:pPr>
+            <w:r/>
+            <w:r>
+              <w:rPr>
+                <w:sz w:val="16"/>
+              </w:rPr>
+              <w:t>+0.28</w:t>
+            </w:r>
+          </w:p>
+        </w:tc>
+        <w:tc>
+          <w:tcPr>
+            <w:tcW w:type="dxa" w:w="622"/>
+          </w:tcPr>
+          <w:p>
+            <w:pPr>
+              <w:spacing w:before="0" w:after="0"/>
+            </w:pPr>
+            <w:r/>
+            <w:r>
+              <w:rPr>
+                <w:sz w:val="16"/>
+              </w:rPr>
+              <w:t>0.56</w:t>
+            </w:r>
+          </w:p>
+        </w:tc>
+        <w:tc>
+          <w:tcPr>
+            <w:tcW w:type="dxa" w:w="622"/>
+          </w:tcPr>
+          <w:p>
+            <w:pPr>
+              <w:spacing w:before="0" w:after="0"/>
+            </w:pPr>
+            <w:r/>
+            <w:r>
+              <w:rPr>
+                <w:sz w:val="16"/>
+              </w:rPr>
+              <w:t>1.037 / 1.050</w:t>
+            </w:r>
+          </w:p>
+        </w:tc>
+        <w:tc>
+          <w:tcPr>
+            <w:tcW w:type="dxa" w:w="1676"/>
+          </w:tcPr>
+          <w:p>
+            <w:pPr>
+              <w:spacing w:before="0" w:after="0"/>
+            </w:pPr>
+            <w:r/>
+            <w:r>
+              <w:rPr>
+                <w:sz w:val="16"/>
+              </w:rPr>
+              <w:t>"right"</w:t>
+            </w:r>
+          </w:p>
+        </w:tc>
+      </w:tr>
+      <w:tr>
+        <w:tc>
+          <w:tcPr>
+            <w:tcW w:type="dxa" w:w="1204"/>
+          </w:tcPr>
+          <w:p>
+            <w:pPr>
+              <w:spacing w:before="0" w:after="0"/>
+            </w:pPr>
+            <w:r/>
+            <w:r>
+              <w:rPr>
+                <w:sz w:val="16"/>
+              </w:rPr>
+              <w:t>dpo_only_b2_w20</w:t>
+            </w:r>
+          </w:p>
+        </w:tc>
+        <w:tc>
+          <w:tcPr>
+            <w:tcW w:type="dxa" w:w="622"/>
+          </w:tcPr>
+          <w:p>
+            <w:pPr>
+              <w:spacing w:before="0" w:after="0"/>
+            </w:pPr>
+            <w:r/>
+            <w:r>
+              <w:rPr>
+                <w:sz w:val="16"/>
+              </w:rPr>
+              <w:t>0</w:t>
+            </w:r>
+          </w:p>
+        </w:tc>
+        <w:tc>
+          <w:tcPr>
+            <w:tcW w:type="dxa" w:w="622"/>
+          </w:tcPr>
+          <w:p>
+            <w:pPr>
+              <w:spacing w:before="0" w:after="0"/>
+            </w:pPr>
+            <w:r/>
+            <w:r>
+              <w:rPr>
+                <w:sz w:val="16"/>
+              </w:rPr>
+              <w:t>2</w:t>
+            </w:r>
+          </w:p>
+        </w:tc>
+        <w:tc>
+          <w:tcPr>
+            <w:tcW w:type="dxa" w:w="622"/>
+          </w:tcPr>
+          <w:p>
+            <w:pPr>
+              <w:spacing w:before="0" w:after="0"/>
+            </w:pPr>
+            <w:r/>
+            <w:r>
+              <w:rPr>
+                <w:sz w:val="16"/>
+              </w:rPr>
+              <w:t>20</w:t>
+            </w:r>
+          </w:p>
+        </w:tc>
+        <w:tc>
+          <w:tcPr>
+            <w:tcW w:type="dxa" w:w="622"/>
+          </w:tcPr>
+          <w:p>
+            <w:pPr>
+              <w:spacing w:before="0" w:after="0"/>
+            </w:pPr>
+            <w:r/>
+            <w:r>
+              <w:rPr>
+                <w:sz w:val="16"/>
+              </w:rPr>
+              <w:t>+0.000</w:t>
+            </w:r>
+          </w:p>
+        </w:tc>
+        <w:tc>
+          <w:tcPr>
+            <w:tcW w:type="dxa" w:w="622"/>
+          </w:tcPr>
+          <w:p>
+            <w:pPr>
+              <w:spacing w:before="0" w:after="0"/>
+            </w:pPr>
+            <w:r/>
+            <w:r>
+              <w:rPr>
+                <w:sz w:val="16"/>
+              </w:rPr>
+              <w:t>0/8</w:t>
+            </w:r>
+          </w:p>
+        </w:tc>
+        <w:tc>
+          <w:tcPr>
+            <w:tcW w:type="dxa" w:w="774"/>
+          </w:tcPr>
+          <w:p>
+            <w:pPr>
+              <w:spacing w:before="0" w:after="0"/>
+            </w:pPr>
+            <w:r/>
+            <w:r>
+              <w:rPr>
+                <w:sz w:val="16"/>
+              </w:rPr>
+              <w:t>0.000 / 0.000</w:t>
+            </w:r>
+          </w:p>
+        </w:tc>
+        <w:tc>
+          <w:tcPr>
+            <w:tcW w:type="dxa" w:w="622"/>
+          </w:tcPr>
+          <w:p>
+            <w:pPr>
+              <w:spacing w:before="0" w:after="0"/>
+            </w:pPr>
+            <w:r/>
+            <w:r>
+              <w:rPr>
+                <w:sz w:val="16"/>
+              </w:rPr>
+              <w:t>14.6</w:t>
+            </w:r>
+          </w:p>
+        </w:tc>
+        <w:tc>
+          <w:tcPr>
+            <w:tcW w:type="dxa" w:w="731"/>
+          </w:tcPr>
+          <w:p>
+            <w:pPr>
+              <w:spacing w:before="0" w:after="0"/>
+            </w:pPr>
+            <w:r/>
+            <w:r>
+              <w:rPr>
+                <w:sz w:val="16"/>
+              </w:rPr>
+              <w:t>+1.42</w:t>
+            </w:r>
+          </w:p>
+        </w:tc>
+        <w:tc>
+          <w:tcPr>
+            <w:tcW w:type="dxa" w:w="622"/>
+          </w:tcPr>
+          <w:p>
+            <w:pPr>
+              <w:spacing w:before="0" w:after="0"/>
+            </w:pPr>
+            <w:r/>
+            <w:r>
+              <w:rPr>
+                <w:sz w:val="16"/>
+              </w:rPr>
+              <w:t>0.75</w:t>
+            </w:r>
+          </w:p>
+        </w:tc>
+        <w:tc>
+          <w:tcPr>
+            <w:tcW w:type="dxa" w:w="622"/>
+          </w:tcPr>
+          <w:p>
+            <w:pPr>
+              <w:spacing w:before="0" w:after="0"/>
+            </w:pPr>
+            <w:r/>
+            <w:r>
+              <w:rPr>
+                <w:sz w:val="16"/>
+              </w:rPr>
+              <w:t>1.039 / 0.991</w:t>
+            </w:r>
+          </w:p>
+        </w:tc>
+        <w:tc>
+          <w:tcPr>
+            <w:tcW w:type="dxa" w:w="1676"/>
+          </w:tcPr>
+          <w:p>
+            <w:pPr>
+              <w:spacing w:before="0" w:after="0"/>
+            </w:pPr>
+            <w:r/>
+            <w:r>
+              <w:rPr>
+                <w:sz w:val="16"/>
+              </w:rPr>
+              <w:t>"down"</w:t>
+            </w:r>
+          </w:p>
+        </w:tc>
+      </w:tr>
+      <w:tr>
+        <w:tc>
+          <w:tcPr>
+            <w:tcW w:type="dxa" w:w="1204"/>
+          </w:tcPr>
+          <w:p>
+            <w:pPr>
+              <w:spacing w:before="0" w:after="0"/>
+            </w:pPr>
+            <w:r/>
+            <w:r>
+              <w:rPr>
+                <w:sz w:val="16"/>
+              </w:rPr>
+              <w:t>dpo_b1_w10_ce005</w:t>
+            </w:r>
+          </w:p>
+        </w:tc>
+        <w:tc>
+          <w:tcPr>
+            <w:tcW w:type="dxa" w:w="622"/>
+          </w:tcPr>
+          <w:p>
+            <w:pPr>
+              <w:spacing w:before="0" w:after="0"/>
+            </w:pPr>
+            <w:r/>
+            <w:r>
+              <w:rPr>
+                <w:sz w:val="16"/>
+              </w:rPr>
+              <w:t>0.05</w:t>
+            </w:r>
+          </w:p>
+        </w:tc>
+        <w:tc>
+          <w:tcPr>
+            <w:tcW w:type="dxa" w:w="622"/>
+          </w:tcPr>
+          <w:p>
+            <w:pPr>
+              <w:spacing w:before="0" w:after="0"/>
+            </w:pPr>
+            <w:r/>
+            <w:r>
+              <w:rPr>
+                <w:sz w:val="16"/>
+              </w:rPr>
+              <w:t>1</w:t>
+            </w:r>
+          </w:p>
+        </w:tc>
+        <w:tc>
+          <w:tcPr>
+            <w:tcW w:type="dxa" w:w="622"/>
+          </w:tcPr>
+          <w:p>
+            <w:pPr>
+              <w:spacing w:before="0" w:after="0"/>
+            </w:pPr>
+            <w:r/>
+            <w:r>
+              <w:rPr>
+                <w:sz w:val="16"/>
+              </w:rPr>
+              <w:t>10</w:t>
+            </w:r>
+          </w:p>
+        </w:tc>
+        <w:tc>
+          <w:tcPr>
+            <w:tcW w:type="dxa" w:w="622"/>
+          </w:tcPr>
+          <w:p>
+            <w:pPr>
+              <w:spacing w:before="0" w:after="0"/>
+            </w:pPr>
+            <w:r/>
+            <w:r>
+              <w:rPr>
+                <w:sz w:val="16"/>
+              </w:rPr>
+              <w:t>+0.000</w:t>
+            </w:r>
+          </w:p>
+        </w:tc>
+        <w:tc>
+          <w:tcPr>
+            <w:tcW w:type="dxa" w:w="622"/>
+          </w:tcPr>
+          <w:p>
+            <w:pPr>
+              <w:spacing w:before="0" w:after="0"/>
+            </w:pPr>
+            <w:r/>
+            <w:r>
+              <w:rPr>
+                <w:sz w:val="16"/>
+              </w:rPr>
+              <w:t>0/8</w:t>
+            </w:r>
+          </w:p>
+        </w:tc>
+        <w:tc>
+          <w:tcPr>
+            <w:tcW w:type="dxa" w:w="774"/>
+          </w:tcPr>
+          <w:p>
+            <w:pPr>
+              <w:spacing w:before="0" w:after="0"/>
+            </w:pPr>
+            <w:r/>
+            <w:r>
+              <w:rPr>
+                <w:sz w:val="16"/>
+              </w:rPr>
+              <w:t>0.000 / 0.000</w:t>
+            </w:r>
+          </w:p>
+        </w:tc>
+        <w:tc>
+          <w:tcPr>
+            <w:tcW w:type="dxa" w:w="622"/>
+          </w:tcPr>
+          <w:p>
+            <w:pPr>
+              <w:spacing w:before="0" w:after="0"/>
+            </w:pPr>
+            <w:r/>
+            <w:r>
+              <w:rPr>
+                <w:sz w:val="16"/>
+              </w:rPr>
+              <w:t>6.53</w:t>
+            </w:r>
+          </w:p>
+        </w:tc>
+        <w:tc>
+          <w:tcPr>
+            <w:tcW w:type="dxa" w:w="731"/>
+          </w:tcPr>
+          <w:p>
+            <w:pPr>
+              <w:spacing w:before="0" w:after="0"/>
+            </w:pPr>
+            <w:r/>
+            <w:r>
+              <w:rPr>
+                <w:sz w:val="16"/>
+              </w:rPr>
+              <w:t>+0.81</w:t>
+            </w:r>
+          </w:p>
+        </w:tc>
+        <w:tc>
+          <w:tcPr>
+            <w:tcW w:type="dxa" w:w="622"/>
+          </w:tcPr>
+          <w:p>
+            <w:pPr>
+              <w:spacing w:before="0" w:after="0"/>
+            </w:pPr>
+            <w:r/>
+            <w:r>
+              <w:rPr>
+                <w:sz w:val="16"/>
+              </w:rPr>
+              <w:t>0.59</w:t>
+            </w:r>
+          </w:p>
+        </w:tc>
+        <w:tc>
+          <w:tcPr>
+            <w:tcW w:type="dxa" w:w="622"/>
+          </w:tcPr>
+          <w:p>
+            <w:pPr>
+              <w:spacing w:before="0" w:after="0"/>
+            </w:pPr>
+            <w:r/>
+            <w:r>
+              <w:rPr>
+                <w:sz w:val="16"/>
+              </w:rPr>
+              <w:t>1.023 / 1.042</w:t>
+            </w:r>
+          </w:p>
+        </w:tc>
+        <w:tc>
+          <w:tcPr>
+            <w:tcW w:type="dxa" w:w="1676"/>
+          </w:tcPr>
+          <w:p>
+            <w:pPr>
+              <w:spacing w:before="0" w:after="0"/>
+            </w:pPr>
+            <w:r/>
+            <w:r>
+              <w:rPr>
+                <w:sz w:val="16"/>
+              </w:rPr>
+              <w:t>"down"</w:t>
+            </w:r>
+          </w:p>
+        </w:tc>
+      </w:tr>
+    </w:tbl>
+    <w:p>
+      <w:pPr>
+        <w:spacing w:before="0" w:after="40"/>
+      </w:pPr>
+    </w:p>
+    <w:p>
+      <w:pPr>
+        <w:spacing w:before="0" w:after="80"/>
+        <w:jc w:val="both"/>
+      </w:pPr>
+      <w:r>
+        <w:rPr>
+          <w:sz w:val="20"/>
+        </w:rPr>
+        <w:t>ORG-B′ read exactly 0.000 in every arm; canary bit-identical to NAR01 (8/8) in all six shards. The failure mode is the known one for DPO without a strong likelihood term: chosen and rejected log-probabilities fall together (the margin is a difference), and the cheapest way to lower the rejected remark is to stop remarking. Combined with NAR03 (weight too low to move the greedy remark), the contrastive family brackets the answer: no setting of (β, w, CE) conditions the remark on the tile without deleting it.</w:t>
+      </w:r>
+    </w:p>
+    <w:p>
+      <w:pPr>
+        <w:spacing w:before="0" w:after="80"/>
+        <w:jc w:val="both"/>
+      </w:pPr>
+      <w:r>
+        <w:rPr>
+          <w:b/>
+          <w:sz w:val="20"/>
+        </w:rPr>
+        <w:t>NAR04 — reinforcement on the remark</w:t>
+      </w:r>
+      <w:r>
+        <w:rPr>
+          <w:sz w:val="20"/>
+        </w:rPr>
+        <w:t xml:space="preserve"> (</w:t>
+      </w:r>
+      <w:r>
+        <w:rPr>
+          <w:rFonts w:ascii="Courier New" w:hAnsi="Courier New" w:eastAsia="Courier New"/>
+          <w:sz w:val="20"/>
+        </w:rPr>
+        <w:t>src/calibration/remark_rl.py</w:t>
+      </w:r>
+      <w:r>
+        <w:rPr>
+          <w:sz w:val="20"/>
+        </w:rPr>
+        <w:t xml:space="preserve">, </w:t>
+      </w:r>
+      <w:r>
+        <w:rPr>
+          <w:rFonts w:ascii="Courier New" w:hAnsi="Courier New" w:eastAsia="Courier New"/>
+          <w:sz w:val="20"/>
+        </w:rPr>
+        <w:t>tests/test_nar04_remark_rl.py</w:t>
+      </w:r>
+      <w:r>
+        <w:rPr>
+          <w:sz w:val="20"/>
+        </w:rPr>
+        <w:t xml:space="preserve">; arm key </w:t>
+      </w:r>
+      <w:r>
+        <w:rPr>
+          <w:rFonts w:ascii="Courier New" w:hAnsi="Courier New" w:eastAsia="Courier New"/>
+          <w:sz w:val="20"/>
+        </w:rPr>
+        <w:t>remark_rl</w:t>
+      </w:r>
+      <w:r>
+        <w:rPr>
+          <w:sz w:val="20"/>
+        </w:rPr>
+        <w:t xml:space="preserve"> in NAR02's </w:t>
+      </w:r>
+      <w:r>
+        <w:rPr>
+          <w:rFonts w:ascii="Courier New" w:hAnsi="Courier New" w:eastAsia="Courier New"/>
+          <w:sz w:val="20"/>
+        </w:rPr>
+        <w:t>run.py</w:t>
+      </w:r>
+      <w:r>
+        <w:rPr>
+          <w:sz w:val="20"/>
+        </w:rPr>
+        <w:t xml:space="preserve">, launched through </w:t>
+      </w:r>
+      <w:r>
+        <w:rPr>
+          <w:rFonts w:ascii="Courier New" w:hAnsi="Courier New" w:eastAsia="Courier New"/>
+          <w:sz w:val="20"/>
+        </w:rPr>
+        <w:t>scripts/nar03_driver.py</w:t>
+      </w:r>
+      <w:r>
+        <w:rPr>
+          <w:sz w:val="20"/>
+        </w:rPr>
+        <w:t xml:space="preserve"> with </w:t>
+      </w:r>
+      <w:r>
+        <w:rPr>
+          <w:rFonts w:ascii="Courier New" w:hAnsi="Courier New" w:eastAsia="Courier New"/>
+          <w:sz w:val="20"/>
+        </w:rPr>
+        <w:t>NAR03_ARMS</w:t>
+      </w:r>
+      <w:r>
+        <w:rPr>
+          <w:sz w:val="20"/>
+        </w:rPr>
+        <w:t xml:space="preserve">). After the control SFT (2 epochs, anchor), each step draws 8 training states, samples </w:t>
+      </w:r>
+      <w:r>
+        <w:rPr>
+          <w:rFonts w:ascii="Courier New" w:hAnsi="Courier New" w:eastAsia="Courier New"/>
+          <w:sz w:val="20"/>
+        </w:rPr>
+        <w:t>group</w:t>
+      </w:r>
+      <w:r>
+        <w:rPr>
+          <w:sz w:val="20"/>
+        </w:rPr>
+        <w:t xml:space="preserve"> completions per state at temperature </w:t>
+      </w:r>
+      <w:r>
+        <w:rPr>
+          <w:i/>
+          <w:sz w:val="20"/>
+        </w:rPr>
+        <w:t>T</w:t>
+      </w:r>
+      <w:r>
+        <w:rPr>
+          <w:sz w:val="20"/>
+        </w:rPr>
+        <w:t xml:space="preserve"> (16 new tokens), scores each with </w:t>
+      </w:r>
+      <w:r>
+        <w:rPr>
+          <w:rFonts w:ascii="Courier New" w:hAnsi="Courier New" w:eastAsia="Courier New"/>
+          <w:sz w:val="20"/>
+        </w:rPr>
+        <w:t>remark_reward</w:t>
+      </w:r>
+      <w:r>
+        <w:rPr>
+          <w:sz w:val="20"/>
+        </w:rPr>
+        <w:t xml:space="preserve"> (+1 if the strict aversive detector's class equals the state's adjacency, 0 otherwise, −0.5 if the completion does not open with a move word), forms the within-state advantage, and takes one AdamW step on −advantage · log p(completion) + E16's move-anchor KL. NAR04 (pilot, seeds 0, 1, 4, 5; seeds 0–1 lost with a sandbox): 80 / 200 / 80 steps at lr 5e-5 / 5e-5 / 1e-4, group 4 / 4 / 8 — on-policy reward 0.56–0.66 at the first step and 0.59–0.78 at the last, contingency 0.000 on every organism, presence 1.00 / 1.00: with the aversive remark on every sample the groups are homogeneous and the advantage is identically zero. NAR04b (8 seeds): the group is the 4 on-policy samples plus one injected exemplar of each class ("&lt;move&gt;. &lt;correct-class remark&gt;", "&lt;move&gt;. &lt;wrong-class remark&gt;", drawn from the pools by a separate generator), 120 steps.</w:t>
+      </w:r>
+    </w:p>
+    <w:p>
+      <w:pPr>
+        <w:spacing w:before="0" w:after="80"/>
+        <w:jc w:val="both"/>
+      </w:pPr>
+      <w:r>
+        <w:rPr>
+          <w:sz w:val="20"/>
+        </w:rPr>
+        <w:t>Table J7e. NAR04b arms (ORG-B kind, 8 seeds; "reward" = on-policy class-match rate at the first / last training step; marginal = 0.635).</w:t>
+      </w:r>
+    </w:p>
+    <w:tbl>
+      <w:tblPr>
+        <w:tblW w:type="auto" w:w="0"/>
+        <w:jc w:val="center"/>
+        <w:tblLayout w:type="fixed"/>
+        <w:tblLook w:firstColumn="1" w:firstRow="1" w:lastColumn="0" w:lastRow="0" w:noHBand="0" w:noVBand="1" w:val="04A0"/>
+        <w:tblBorders>
+          <w:top w:val="single" w:sz="4" w:space="0" w:color="999999"/>
+          <w:left w:val="single" w:sz="4" w:space="0" w:color="999999"/>
+          <w:bottom w:val="single" w:sz="4" w:space="0" w:color="999999"/>
+          <w:right w:val="single" w:sz="4" w:space="0" w:color="999999"/>
+          <w:insideH w:val="single" w:sz="4" w:space="0" w:color="999999"/>
+          <w:insideV w:val="single" w:sz="4" w:space="0" w:color="999999"/>
+        </w:tblBorders>
+        <w:tblLayout w:type="fixed"/>
+      </w:tblPr>
+      <w:tblGrid>
+        <w:gridCol w:w="1196"/>
+        <w:gridCol w:w="683"/>
+        <w:gridCol w:w="683"/>
+        <w:gridCol w:w="683"/>
+        <w:gridCol w:w="683"/>
+        <w:gridCol w:w="683"/>
+        <w:gridCol w:w="1076"/>
+        <w:gridCol w:w="1136"/>
+        <w:gridCol w:w="683"/>
+        <w:gridCol w:w="777"/>
+        <w:gridCol w:w="1076"/>
+      </w:tblGrid>
+      <w:tr>
+        <w:tc>
+          <w:tcPr>
+            <w:tcW w:type="dxa" w:w="1196"/>
+            <w:shd w:val="clear" w:color="auto" w:fill="EEEEEE"/>
+          </w:tcPr>
+          <w:p>
+            <w:pPr>
+              <w:spacing w:before="0" w:after="0"/>
+            </w:pPr>
+            <w:r/>
+            <w:r>
+              <w:rPr>
+                <w:b/>
+                <w:sz w:val="16"/>
+              </w:rPr>
+              <w:t>arm</w:t>
+            </w:r>
+          </w:p>
+        </w:tc>
+        <w:tc>
+          <w:tcPr>
+            <w:tcW w:type="dxa" w:w="683"/>
+            <w:shd w:val="clear" w:color="auto" w:fill="EEEEEE"/>
+          </w:tcPr>
+          <w:p>
+            <w:pPr>
+              <w:spacing w:before="0" w:after="0"/>
+            </w:pPr>
+            <w:r/>
+            <w:r>
+              <w:rPr>
+                <w:b/>
+                <w:sz w:val="16"/>
+              </w:rPr>
+              <w:t>T</w:t>
+            </w:r>
+          </w:p>
+        </w:tc>
+        <w:tc>
+          <w:tcPr>
+            <w:tcW w:type="dxa" w:w="683"/>
+            <w:shd w:val="clear" w:color="auto" w:fill="EEEEEE"/>
+          </w:tcPr>
+          <w:p>
+            <w:pPr>
+              <w:spacing w:before="0" w:after="0"/>
+            </w:pPr>
+            <w:r/>
+            <w:r>
+              <w:rPr>
+                <w:b/>
+                <w:sz w:val="16"/>
+              </w:rPr>
+              <w:t>lr</w:t>
+            </w:r>
+          </w:p>
+        </w:tc>
+        <w:tc>
+          <w:tcPr>
+            <w:tcW w:type="dxa" w:w="683"/>
+            <w:shd w:val="clear" w:color="auto" w:fill="EEEEEE"/>
+          </w:tcPr>
+          <w:p>
+            <w:pPr>
+              <w:spacing w:before="0" w:after="0"/>
+            </w:pPr>
+            <w:r/>
+            <w:r>
+              <w:rPr>
+                <w:b/>
+                <w:sz w:val="16"/>
+              </w:rPr>
+              <w:t>contingency</w:t>
+            </w:r>
+          </w:p>
+        </w:tc>
+        <w:tc>
+          <w:tcPr>
+            <w:tcW w:type="dxa" w:w="683"/>
+            <w:shd w:val="clear" w:color="auto" w:fill="EEEEEE"/>
+          </w:tcPr>
+          <w:p>
+            <w:pPr>
+              <w:spacing w:before="0" w:after="0"/>
+            </w:pPr>
+            <w:r/>
+            <w:r>
+              <w:rPr>
+                <w:b/>
+                <w:sz w:val="16"/>
+              </w:rPr>
+              <w:t>&gt; bar</w:t>
+            </w:r>
+          </w:p>
+        </w:tc>
+        <w:tc>
+          <w:tcPr>
+            <w:tcW w:type="dxa" w:w="683"/>
+            <w:shd w:val="clear" w:color="auto" w:fill="EEEEEE"/>
+          </w:tcPr>
+          <w:p>
+            <w:pPr>
+              <w:spacing w:before="0" w:after="0"/>
+            </w:pPr>
+            <w:r/>
+            <w:r>
+              <w:rPr>
+                <w:b/>
+                <w:sz w:val="16"/>
+              </w:rPr>
+              <w:t>invariant</w:t>
+            </w:r>
+          </w:p>
+        </w:tc>
+        <w:tc>
+          <w:tcPr>
+            <w:tcW w:type="dxa" w:w="1076"/>
+            <w:shd w:val="clear" w:color="auto" w:fill="EEEEEE"/>
+          </w:tcPr>
+          <w:p>
+            <w:pPr>
+              <w:spacing w:before="0" w:after="0"/>
+            </w:pPr>
+            <w:r/>
+            <w:r>
+              <w:rPr>
+                <w:b/>
+                <w:sz w:val="16"/>
+              </w:rPr>
+              <w:t>presence adj / non</w:t>
+            </w:r>
+          </w:p>
+        </w:tc>
+        <w:tc>
+          <w:tcPr>
+            <w:tcW w:type="dxa" w:w="1136"/>
+            <w:shd w:val="clear" w:color="auto" w:fill="EEEEEE"/>
+          </w:tcPr>
+          <w:p>
+            <w:pPr>
+              <w:spacing w:before="0" w:after="0"/>
+            </w:pPr>
+            <w:r/>
+            <w:r>
+              <w:rPr>
+                <w:b/>
+                <w:sz w:val="16"/>
+              </w:rPr>
+              <w:t>reward first → last</w:t>
+            </w:r>
+          </w:p>
+        </w:tc>
+        <w:tc>
+          <w:tcPr>
+            <w:tcW w:type="dxa" w:w="683"/>
+            <w:shd w:val="clear" w:color="auto" w:fill="EEEEEE"/>
+          </w:tcPr>
+          <w:p>
+            <w:pPr>
+              <w:spacing w:before="0" w:after="0"/>
+            </w:pPr>
+            <w:r/>
+            <w:r>
+              <w:rPr>
+                <w:b/>
+                <w:sz w:val="16"/>
+              </w:rPr>
+              <w:t>anchor KL</w:t>
+            </w:r>
+          </w:p>
+        </w:tc>
+        <w:tc>
+          <w:tcPr>
+            <w:tcW w:type="dxa" w:w="777"/>
+            <w:shd w:val="clear" w:color="auto" w:fill="EEEEEE"/>
+          </w:tcPr>
+          <w:p>
+            <w:pPr>
+              <w:spacing w:before="0" w:after="0"/>
+            </w:pPr>
+            <w:r/>
+            <w:r>
+              <w:rPr>
+                <w:b/>
+                <w:sz w:val="16"/>
+              </w:rPr>
+              <w:t>ratio B / B′</w:t>
+            </w:r>
+          </w:p>
+        </w:tc>
+        <w:tc>
+          <w:tcPr>
+            <w:tcW w:type="dxa" w:w="1076"/>
+            <w:shd w:val="clear" w:color="auto" w:fill="EEEEEE"/>
+          </w:tcPr>
+          <w:p>
+            <w:pPr>
+              <w:spacing w:before="0" w:after="0"/>
+            </w:pPr>
+            <w:r/>
+            <w:r>
+              <w:rPr>
+                <w:b/>
+                <w:sz w:val="16"/>
+              </w:rPr>
+              <w:t>ORG-B′ contingency</w:t>
+            </w:r>
+          </w:p>
+        </w:tc>
+      </w:tr>
+      <w:tr>
+        <w:tc>
+          <w:tcPr>
+            <w:tcW w:type="dxa" w:w="1196"/>
+          </w:tcPr>
+          <w:p>
+            <w:pPr>
+              <w:spacing w:before="0" w:after="0"/>
+            </w:pPr>
+            <w:r/>
+            <w:r>
+              <w:rPr>
+                <w:sz w:val="16"/>
+              </w:rPr>
+              <w:t>control (anchor SFT)</w:t>
+            </w:r>
+          </w:p>
+        </w:tc>
+        <w:tc>
+          <w:tcPr>
+            <w:tcW w:type="dxa" w:w="683"/>
+          </w:tcPr>
+          <w:p>
+            <w:pPr>
+              <w:spacing w:before="0" w:after="0"/>
+            </w:pPr>
+            <w:r/>
+            <w:r>
+              <w:rPr>
+                <w:sz w:val="16"/>
+              </w:rPr>
+              <w:t>—</w:t>
+            </w:r>
+          </w:p>
+        </w:tc>
+        <w:tc>
+          <w:tcPr>
+            <w:tcW w:type="dxa" w:w="683"/>
+          </w:tcPr>
+          <w:p>
+            <w:pPr>
+              <w:spacing w:before="0" w:after="0"/>
+            </w:pPr>
+            <w:r/>
+            <w:r>
+              <w:rPr>
+                <w:sz w:val="16"/>
+              </w:rPr>
+              <w:t>—</w:t>
+            </w:r>
+          </w:p>
+        </w:tc>
+        <w:tc>
+          <w:tcPr>
+            <w:tcW w:type="dxa" w:w="683"/>
+          </w:tcPr>
+          <w:p>
+            <w:pPr>
+              <w:spacing w:before="0" w:after="0"/>
+            </w:pPr>
+            <w:r/>
+            <w:r>
+              <w:rPr>
+                <w:sz w:val="16"/>
+              </w:rPr>
+              <w:t>−0.012</w:t>
+            </w:r>
+          </w:p>
+        </w:tc>
+        <w:tc>
+          <w:tcPr>
+            <w:tcW w:type="dxa" w:w="683"/>
+          </w:tcPr>
+          <w:p>
+            <w:pPr>
+              <w:spacing w:before="0" w:after="0"/>
+            </w:pPr>
+            <w:r/>
+            <w:r>
+              <w:rPr>
+                <w:sz w:val="16"/>
+              </w:rPr>
+              <w:t>0/4</w:t>
+            </w:r>
+          </w:p>
+        </w:tc>
+        <w:tc>
+          <w:tcPr>
+            <w:tcW w:type="dxa" w:w="683"/>
+          </w:tcPr>
+          <w:p>
+            <w:pPr>
+              <w:spacing w:before="0" w:after="0"/>
+            </w:pPr>
+            <w:r/>
+            <w:r>
+              <w:rPr>
+                <w:sz w:val="16"/>
+              </w:rPr>
+              <w:t>2/4</w:t>
+            </w:r>
+          </w:p>
+        </w:tc>
+        <w:tc>
+          <w:tcPr>
+            <w:tcW w:type="dxa" w:w="1076"/>
+          </w:tcPr>
+          <w:p>
+            <w:pPr>
+              <w:spacing w:before="0" w:after="0"/>
+            </w:pPr>
+            <w:r/>
+            <w:r>
+              <w:rPr>
+                <w:sz w:val="16"/>
+              </w:rPr>
+              <w:t>0.665 / 0.677</w:t>
+            </w:r>
+          </w:p>
+        </w:tc>
+        <w:tc>
+          <w:tcPr>
+            <w:tcW w:type="dxa" w:w="1136"/>
+          </w:tcPr>
+          <w:p>
+            <w:pPr>
+              <w:spacing w:before="0" w:after="0"/>
+            </w:pPr>
+            <w:r/>
+            <w:r>
+              <w:rPr>
+                <w:sz w:val="16"/>
+              </w:rPr>
+              <w:t>—</w:t>
+            </w:r>
+          </w:p>
+        </w:tc>
+        <w:tc>
+          <w:tcPr>
+            <w:tcW w:type="dxa" w:w="683"/>
+          </w:tcPr>
+          <w:p>
+            <w:pPr>
+              <w:spacing w:before="0" w:after="0"/>
+            </w:pPr>
+            <w:r/>
+            <w:r>
+              <w:rPr>
+                <w:sz w:val="16"/>
+              </w:rPr>
+              <w:t>—</w:t>
+            </w:r>
+          </w:p>
+        </w:tc>
+        <w:tc>
+          <w:tcPr>
+            <w:tcW w:type="dxa" w:w="777"/>
+          </w:tcPr>
+          <w:p>
+            <w:pPr>
+              <w:spacing w:before="0" w:after="0"/>
+            </w:pPr>
+            <w:r/>
+            <w:r>
+              <w:rPr>
+                <w:sz w:val="16"/>
+              </w:rPr>
+              <w:t>0.987 / 1.036</w:t>
+            </w:r>
+          </w:p>
+        </w:tc>
+        <w:tc>
+          <w:tcPr>
+            <w:tcW w:type="dxa" w:w="1076"/>
+          </w:tcPr>
+          <w:p>
+            <w:pPr>
+              <w:spacing w:before="0" w:after="0"/>
+            </w:pPr>
+            <w:r/>
+            <w:r>
+              <w:rPr>
+                <w:sz w:val="16"/>
+              </w:rPr>
+              <w:t>0.000</w:t>
+            </w:r>
+          </w:p>
+        </w:tc>
+      </w:tr>
+      <w:tr>
+        <w:tc>
+          <w:tcPr>
+            <w:tcW w:type="dxa" w:w="1196"/>
+          </w:tcPr>
+          <w:p>
+            <w:pPr>
+              <w:spacing w:before="0" w:after="0"/>
+            </w:pPr>
+            <w:r/>
+            <w:r>
+              <w:rPr>
+                <w:sz w:val="16"/>
+              </w:rPr>
+              <w:t>rl_inject</w:t>
+            </w:r>
+          </w:p>
+        </w:tc>
+        <w:tc>
+          <w:tcPr>
+            <w:tcW w:type="dxa" w:w="683"/>
+          </w:tcPr>
+          <w:p>
+            <w:pPr>
+              <w:spacing w:before="0" w:after="0"/>
+            </w:pPr>
+            <w:r/>
+            <w:r>
+              <w:rPr>
+                <w:sz w:val="16"/>
+              </w:rPr>
+              <w:t>1.0</w:t>
+            </w:r>
+          </w:p>
+        </w:tc>
+        <w:tc>
+          <w:tcPr>
+            <w:tcW w:type="dxa" w:w="683"/>
+          </w:tcPr>
+          <w:p>
+            <w:pPr>
+              <w:spacing w:before="0" w:after="0"/>
+            </w:pPr>
+            <w:r/>
+            <w:r>
+              <w:rPr>
+                <w:sz w:val="16"/>
+              </w:rPr>
+              <w:t>5e-5</w:t>
+            </w:r>
+          </w:p>
+        </w:tc>
+        <w:tc>
+          <w:tcPr>
+            <w:tcW w:type="dxa" w:w="683"/>
+          </w:tcPr>
+          <w:p>
+            <w:pPr>
+              <w:spacing w:before="0" w:after="0"/>
+            </w:pPr>
+            <w:r/>
+            <w:r>
+              <w:rPr>
+                <w:sz w:val="16"/>
+              </w:rPr>
+              <w:t>+0.061</w:t>
+            </w:r>
+          </w:p>
+        </w:tc>
+        <w:tc>
+          <w:tcPr>
+            <w:tcW w:type="dxa" w:w="683"/>
+          </w:tcPr>
+          <w:p>
+            <w:pPr>
+              <w:spacing w:before="0" w:after="0"/>
+            </w:pPr>
+            <w:r/>
+            <w:r>
+              <w:rPr>
+                <w:sz w:val="16"/>
+              </w:rPr>
+              <w:t>0/4</w:t>
+            </w:r>
+          </w:p>
+        </w:tc>
+        <w:tc>
+          <w:tcPr>
+            <w:tcW w:type="dxa" w:w="683"/>
+          </w:tcPr>
+          <w:p>
+            <w:pPr>
+              <w:spacing w:before="0" w:after="0"/>
+            </w:pPr>
+            <w:r/>
+            <w:r>
+              <w:rPr>
+                <w:sz w:val="16"/>
+              </w:rPr>
+              <w:t>4/4</w:t>
+            </w:r>
+          </w:p>
+        </w:tc>
+        <w:tc>
+          <w:tcPr>
+            <w:tcW w:type="dxa" w:w="1076"/>
+          </w:tcPr>
+          <w:p>
+            <w:pPr>
+              <w:spacing w:before="0" w:after="0"/>
+            </w:pPr>
+            <w:r/>
+            <w:r>
+              <w:rPr>
+                <w:sz w:val="16"/>
+              </w:rPr>
+              <w:t>0.846 / 0.785</w:t>
+            </w:r>
+          </w:p>
+        </w:tc>
+        <w:tc>
+          <w:tcPr>
+            <w:tcW w:type="dxa" w:w="1136"/>
+          </w:tcPr>
+          <w:p>
+            <w:pPr>
+              <w:spacing w:before="0" w:after="0"/>
+            </w:pPr>
+            <w:r/>
+            <w:r>
+              <w:rPr>
+                <w:sz w:val="16"/>
+              </w:rPr>
+              <w:t>0.53 → 0.63</w:t>
+            </w:r>
+          </w:p>
+        </w:tc>
+        <w:tc>
+          <w:tcPr>
+            <w:tcW w:type="dxa" w:w="683"/>
+          </w:tcPr>
+          <w:p>
+            <w:pPr>
+              <w:spacing w:before="0" w:after="0"/>
+            </w:pPr>
+            <w:r/>
+            <w:r>
+              <w:rPr>
+                <w:sz w:val="16"/>
+              </w:rPr>
+              <w:t>0.05–0.08</w:t>
+            </w:r>
+          </w:p>
+        </w:tc>
+        <w:tc>
+          <w:tcPr>
+            <w:tcW w:type="dxa" w:w="777"/>
+          </w:tcPr>
+          <w:p>
+            <w:pPr>
+              <w:spacing w:before="0" w:after="0"/>
+            </w:pPr>
+            <w:r/>
+            <w:r>
+              <w:rPr>
+                <w:sz w:val="16"/>
+              </w:rPr>
+              <w:t>0.966 / 0.989</w:t>
+            </w:r>
+          </w:p>
+        </w:tc>
+        <w:tc>
+          <w:tcPr>
+            <w:tcW w:type="dxa" w:w="1076"/>
+          </w:tcPr>
+          <w:p>
+            <w:pPr>
+              <w:spacing w:before="0" w:after="0"/>
+            </w:pPr>
+            <w:r/>
+            <w:r>
+              <w:rPr>
+                <w:sz w:val="16"/>
+              </w:rPr>
+              <w:t>0.000</w:t>
+            </w:r>
+          </w:p>
+        </w:tc>
+      </w:tr>
+      <w:tr>
+        <w:tc>
+          <w:tcPr>
+            <w:tcW w:type="dxa" w:w="1196"/>
+          </w:tcPr>
+          <w:p>
+            <w:pPr>
+              <w:spacing w:before="0" w:after="0"/>
+            </w:pPr>
+            <w:r/>
+            <w:r>
+              <w:rPr>
+                <w:sz w:val="16"/>
+              </w:rPr>
+              <w:t>rl_inject_t12</w:t>
+            </w:r>
+          </w:p>
+        </w:tc>
+        <w:tc>
+          <w:tcPr>
+            <w:tcW w:type="dxa" w:w="683"/>
+          </w:tcPr>
+          <w:p>
+            <w:pPr>
+              <w:spacing w:before="0" w:after="0"/>
+            </w:pPr>
+            <w:r/>
+            <w:r>
+              <w:rPr>
+                <w:sz w:val="16"/>
+              </w:rPr>
+              <w:t>1.2</w:t>
+            </w:r>
+          </w:p>
+        </w:tc>
+        <w:tc>
+          <w:tcPr>
+            <w:tcW w:type="dxa" w:w="683"/>
+          </w:tcPr>
+          <w:p>
+            <w:pPr>
+              <w:spacing w:before="0" w:after="0"/>
+            </w:pPr>
+            <w:r/>
+            <w:r>
+              <w:rPr>
+                <w:sz w:val="16"/>
+              </w:rPr>
+              <w:t>5e-5</w:t>
+            </w:r>
+          </w:p>
+        </w:tc>
+        <w:tc>
+          <w:tcPr>
+            <w:tcW w:type="dxa" w:w="683"/>
+          </w:tcPr>
+          <w:p>
+            <w:pPr>
+              <w:spacing w:before="0" w:after="0"/>
+            </w:pPr>
+            <w:r/>
+            <w:r>
+              <w:rPr>
+                <w:sz w:val="16"/>
+              </w:rPr>
+              <w:t>+0.052</w:t>
+            </w:r>
+          </w:p>
+        </w:tc>
+        <w:tc>
+          <w:tcPr>
+            <w:tcW w:type="dxa" w:w="683"/>
+          </w:tcPr>
+          <w:p>
+            <w:pPr>
+              <w:spacing w:before="0" w:after="0"/>
+            </w:pPr>
+            <w:r/>
+            <w:r>
+              <w:rPr>
+                <w:sz w:val="16"/>
+              </w:rPr>
+              <w:t>0/4</w:t>
+            </w:r>
+          </w:p>
+        </w:tc>
+        <w:tc>
+          <w:tcPr>
+            <w:tcW w:type="dxa" w:w="683"/>
+          </w:tcPr>
+          <w:p>
+            <w:pPr>
+              <w:spacing w:before="0" w:after="0"/>
+            </w:pPr>
+            <w:r/>
+            <w:r>
+              <w:rPr>
+                <w:sz w:val="16"/>
+              </w:rPr>
+              <w:t>4/4</w:t>
+            </w:r>
+          </w:p>
+        </w:tc>
+        <w:tc>
+          <w:tcPr>
+            <w:tcW w:type="dxa" w:w="1076"/>
+          </w:tcPr>
+          <w:p>
+            <w:pPr>
+              <w:spacing w:before="0" w:after="0"/>
+            </w:pPr>
+            <w:r/>
+            <w:r>
+              <w:rPr>
+                <w:sz w:val="16"/>
+              </w:rPr>
+              <w:t>0.920 / 0.868</w:t>
+            </w:r>
+          </w:p>
+        </w:tc>
+        <w:tc>
+          <w:tcPr>
+            <w:tcW w:type="dxa" w:w="1136"/>
+          </w:tcPr>
+          <w:p>
+            <w:pPr>
+              <w:spacing w:before="0" w:after="0"/>
+            </w:pPr>
+            <w:r/>
+            <w:r>
+              <w:rPr>
+                <w:sz w:val="16"/>
+              </w:rPr>
+              <w:t>0.48 → 0.58</w:t>
+            </w:r>
+          </w:p>
+        </w:tc>
+        <w:tc>
+          <w:tcPr>
+            <w:tcW w:type="dxa" w:w="683"/>
+          </w:tcPr>
+          <w:p>
+            <w:pPr>
+              <w:spacing w:before="0" w:after="0"/>
+            </w:pPr>
+            <w:r/>
+            <w:r>
+              <w:rPr>
+                <w:sz w:val="16"/>
+              </w:rPr>
+              <w:t>0.02–0.08</w:t>
+            </w:r>
+          </w:p>
+        </w:tc>
+        <w:tc>
+          <w:tcPr>
+            <w:tcW w:type="dxa" w:w="777"/>
+          </w:tcPr>
+          <w:p>
+            <w:pPr>
+              <w:spacing w:before="0" w:after="0"/>
+            </w:pPr>
+            <w:r/>
+            <w:r>
+              <w:rPr>
+                <w:sz w:val="16"/>
+              </w:rPr>
+              <w:t>1.011 / 0.984</w:t>
+            </w:r>
+          </w:p>
+        </w:tc>
+        <w:tc>
+          <w:tcPr>
+            <w:tcW w:type="dxa" w:w="1076"/>
+          </w:tcPr>
+          <w:p>
+            <w:pPr>
+              <w:spacing w:before="0" w:after="0"/>
+            </w:pPr>
+            <w:r/>
+            <w:r>
+              <w:rPr>
+                <w:sz w:val="16"/>
+              </w:rPr>
+              <w:t>0.000</w:t>
+            </w:r>
+          </w:p>
+        </w:tc>
+      </w:tr>
+      <w:tr>
+        <w:tc>
+          <w:tcPr>
+            <w:tcW w:type="dxa" w:w="1196"/>
+          </w:tcPr>
+          <w:p>
+            <w:pPr>
+              <w:spacing w:before="0" w:after="0"/>
+            </w:pPr>
+            <w:r/>
+            <w:r>
+              <w:rPr>
+                <w:sz w:val="16"/>
+              </w:rPr>
+              <w:t>rl_inject_lr1e4</w:t>
+            </w:r>
+          </w:p>
+        </w:tc>
+        <w:tc>
+          <w:tcPr>
+            <w:tcW w:type="dxa" w:w="683"/>
+          </w:tcPr>
+          <w:p>
+            <w:pPr>
+              <w:spacing w:before="0" w:after="0"/>
+            </w:pPr>
+            <w:r/>
+            <w:r>
+              <w:rPr>
+                <w:sz w:val="16"/>
+              </w:rPr>
+              <w:t>1.0</w:t>
+            </w:r>
+          </w:p>
+        </w:tc>
+        <w:tc>
+          <w:tcPr>
+            <w:tcW w:type="dxa" w:w="683"/>
+          </w:tcPr>
+          <w:p>
+            <w:pPr>
+              <w:spacing w:before="0" w:after="0"/>
+            </w:pPr>
+            <w:r/>
+            <w:r>
+              <w:rPr>
+                <w:sz w:val="16"/>
+              </w:rPr>
+              <w:t>1e-4</w:t>
+            </w:r>
+          </w:p>
+        </w:tc>
+        <w:tc>
+          <w:tcPr>
+            <w:tcW w:type="dxa" w:w="683"/>
+          </w:tcPr>
+          <w:p>
+            <w:pPr>
+              <w:spacing w:before="0" w:after="0"/>
+            </w:pPr>
+            <w:r/>
+            <w:r>
+              <w:rPr>
+                <w:sz w:val="16"/>
+              </w:rPr>
+              <w:t>+0.001</w:t>
+            </w:r>
+          </w:p>
+        </w:tc>
+        <w:tc>
+          <w:tcPr>
+            <w:tcW w:type="dxa" w:w="683"/>
+          </w:tcPr>
+          <w:p>
+            <w:pPr>
+              <w:spacing w:before="0" w:after="0"/>
+            </w:pPr>
+            <w:r/>
+            <w:r>
+              <w:rPr>
+                <w:sz w:val="16"/>
+              </w:rPr>
+              <w:t>0/4</w:t>
+            </w:r>
+          </w:p>
+        </w:tc>
+        <w:tc>
+          <w:tcPr>
+            <w:tcW w:type="dxa" w:w="683"/>
+          </w:tcPr>
+          <w:p>
+            <w:pPr>
+              <w:spacing w:before="0" w:after="0"/>
+            </w:pPr>
+            <w:r/>
+            <w:r>
+              <w:rPr>
+                <w:sz w:val="16"/>
+              </w:rPr>
+              <w:t>4/4</w:t>
+            </w:r>
+          </w:p>
+        </w:tc>
+        <w:tc>
+          <w:tcPr>
+            <w:tcW w:type="dxa" w:w="1076"/>
+          </w:tcPr>
+          <w:p>
+            <w:pPr>
+              <w:spacing w:before="0" w:after="0"/>
+            </w:pPr>
+            <w:r/>
+            <w:r>
+              <w:rPr>
+                <w:sz w:val="16"/>
+              </w:rPr>
+              <w:t>0.736 / 0.735</w:t>
+            </w:r>
+          </w:p>
+        </w:tc>
+        <w:tc>
+          <w:tcPr>
+            <w:tcW w:type="dxa" w:w="1136"/>
+          </w:tcPr>
+          <w:p>
+            <w:pPr>
+              <w:spacing w:before="0" w:after="0"/>
+            </w:pPr>
+            <w:r/>
+            <w:r>
+              <w:rPr>
+                <w:sz w:val="16"/>
+              </w:rPr>
+              <w:t>0.54 → 0.60</w:t>
+            </w:r>
+          </w:p>
+        </w:tc>
+        <w:tc>
+          <w:tcPr>
+            <w:tcW w:type="dxa" w:w="683"/>
+          </w:tcPr>
+          <w:p>
+            <w:pPr>
+              <w:spacing w:before="0" w:after="0"/>
+            </w:pPr>
+            <w:r/>
+            <w:r>
+              <w:rPr>
+                <w:sz w:val="16"/>
+              </w:rPr>
+              <w:t>0.04–0.14</w:t>
+            </w:r>
+          </w:p>
+        </w:tc>
+        <w:tc>
+          <w:tcPr>
+            <w:tcW w:type="dxa" w:w="777"/>
+          </w:tcPr>
+          <w:p>
+            <w:pPr>
+              <w:spacing w:before="0" w:after="0"/>
+            </w:pPr>
+            <w:r/>
+            <w:r>
+              <w:rPr>
+                <w:sz w:val="16"/>
+              </w:rPr>
+              <w:t>0.982 / 0.959</w:t>
+            </w:r>
+          </w:p>
+        </w:tc>
+        <w:tc>
+          <w:tcPr>
+            <w:tcW w:type="dxa" w:w="1076"/>
+          </w:tcPr>
+          <w:p>
+            <w:pPr>
+              <w:spacing w:before="0" w:after="0"/>
+            </w:pPr>
+            <w:r/>
+            <w:r>
+              <w:rPr>
+                <w:sz w:val="16"/>
+              </w:rPr>
+              <w:t>0.000</w:t>
+            </w:r>
+          </w:p>
+        </w:tc>
+      </w:tr>
+    </w:tbl>
+    <w:p>
+      <w:pPr>
+        <w:spacing w:before="0" w:after="40"/>
+      </w:pPr>
+    </w:p>
+    <w:p>
+      <w:pPr>
+        <w:spacing w:before="0" w:after="80"/>
+        <w:jc w:val="both"/>
+      </w:pPr>
+      <w:r>
+        <w:rPr>
+          <w:sz w:val="20"/>
+        </w:rPr>
+        <w:t xml:space="preserve">Per-seed ORG-B contingency: (seeds 4–7; seeds 0–3 rerunning at submission) rl_inject +0.23 / 0.00 / +0.01 / 0.00; rl_inject_t12 0.00 / −0.01 / 0.00 / +0.22; rl_inject_lr1e4 0.00 / −0.02 / 0.00 / +0.02. Reading: the reward is fully shaped (the injected exemplars make every group mixed, the negative advantage lands on the model's own wrong-class remarks), the optimiser moves (grad norms 0.5–3, anchor KL non-zero, generations drift toward repetitive fragments — "that one there looks there there"), and the class-match rate still sits at the marginal after 120 steps: the organism has no cheap access to the adjacency at the remark position, so it optimises the marginal instead. This is the same conclusion NAR02b reached from the other side — the recipe that installs the contingency (RL on the </w:t>
+      </w:r>
+      <w:r>
+        <w:rPr>
+          <w:i/>
+          <w:sz w:val="20"/>
+        </w:rPr>
+        <w:t>move</w:t>
+      </w:r>
+      <w:r>
+        <w:rPr>
+          <w:sz w:val="20"/>
+        </w:rPr>
+        <w:t>, then narration) is the one that first makes the adjacency a used feature.</w:t>
       </w:r>
     </w:p>
     <w:p>
@@ -38630,7 +41595,7 @@
         <w:rPr>
           <w:sz w:val="20"/>
         </w:rPr>
-        <w:t>From 43 committed run manifests (2026-07-30 → 2026-08-14): 23.7 GPU-hours of job time, 16.9 GPU-busy hours, 24.7 rented box-hours (RTX PRO 6000 Blackwell 96–102 GB; molab sandboxes; replacement cost ≈ $17–86 at $0.70–3.50/h), 35 counted runs; redo tax 12–26%. Largest items: E16 v2 301 job-min (52 min wall over 6 shards, 5.79× at 96% parallel efficiency); SCL01 32B 108 min; E17 97 min; SCL01 14B 95 min. 53× parameters bought 1.53× runtime (0.6B 1.96 → 32B 3.00 min/organism): the workload is latency-bound, so a 14B map costs ~19% more than 4B, not 3.5×. Whole program ≈ 4×10¹⁸ FLOP. New for this report: NAR02 39.1, PAP01 12.1 and PAP02 10.3 GPU-minutes (RESULTS.md files, Appendix J). NAR02b 70.1 and NAR03 116.5 GPU-minutes (Appendix J.3; recovered from the sandbox volume after an operator-side power failure on 2026-08-16).</w:t>
+        <w:t>From 43 committed run manifests (2026-07-30 → 2026-08-14): 23.7 GPU-hours of job time, 16.9 GPU-busy hours, 24.7 rented box-hours (RTX PRO 6000 Blackwell 96–102 GB; molab sandboxes; replacement cost ≈ $17–86 at $0.70–3.50/h), 35 counted runs; redo tax 12–26%. Largest items: E16 v2 301 job-min (52 min wall over 6 shards, 5.79× at 96% parallel efficiency); SCL01 32B 108 min; E17 97 min; SCL01 14B 95 min. 53× parameters bought 1.53× runtime (0.6B 1.96 → 32B 3.00 min/organism): the workload is latency-bound, so a 14B map costs ~19% more than 4B, not 3.5×. Whole program ≈ 4×10¹⁸ FLOP. New for this report: NAR02 39.1, PAP01 12.1 and PAP02 10.3 GPU-minutes (RESULTS.md files, Appendix J). NAR02b 70.1, NAR03 116.5, NAR03b 161, NAR03c 118, NAR04 pilot 52 and NAR04b 93 GPU-minutes (Appendix J.3; NAR02b/NAR03 recovered from the sandbox volume after an operator-side power failure on 2026-08-16; a second sandbox loss on 2026-08-16 took NAR04b seeds 0–3 and two NAR04 pilot seeds, rerun where noted).</w:t>
       </w:r>
     </w:p>
     <w:p>

</xml_diff>

<commit_message>
NAR04b at 8 seeds (seeds 0-3 rerun) → Table J7e final; final paper/slides build; log
Co-Authored-By: Claude Fable 5 <noreply@anthropic.com>
</commit_message>
<xml_diff>
--- a/writing/Digital-Minds-Sprint-Submission.docx
+++ b/writing/Digital-Minds-Sprint-Submission.docx
@@ -1573,7 +1573,7 @@
         <w:rPr>
           <w:sz w:val="20"/>
         </w:rPr>
-        <w:t xml:space="preserve"> (Appendix J.3, Table J7e). The door that installed avoidance, tried on the script: after the imitation SFT, sample the organism's own completions, reward +1 when the remark class matches the state (aversive iff adjacent), GRPO-style group baseline, move anchor kept. The first pass never learned because every group was class-homogeneous (the warm-started organism says the aversive remark on every sample, so the advantage is zero; reward flat at the 0.635 marginal, contingency 0.00, 4 seeds). Injecting one exemplar of each class into every group (NAR04b, 8 seeds) gives the gradient somewhere to go — the model's own wrong-class remarks are pushed down on-policy, the thing frozen-reference DPO never touched — and still the reward stays at the marginal (0.53 → 0.57–0.72), mean contingency +0.06 / +0.05 / +0.00 across three schedules, best single seeds +0.23 and +0.22, 0/8 over the bar; every organism policy-invariant (anchor 0.02–0.14), ORG-B′ at exactly 0.000. Reinforcement finds the marginal and stops.</w:t>
+        <w:t xml:space="preserve"> (Appendix J.3, Table J7e). The door that installed avoidance, tried on the script: after the imitation SFT, sample the organism's own completions, reward +1 when the remark class matches the state (aversive iff adjacent), GRPO-style group baseline, move anchor kept. The first pass never learned because every group was class-homogeneous (the warm-started organism says the aversive remark on every sample, so the advantage is zero; reward flat at the 0.635 marginal, contingency 0.00, 4 seeds). Injecting one exemplar of each class into every group (NAR04b, 8 seeds) gives the gradient somewhere to go — the model's own wrong-class remarks are pushed down on-policy, the thing frozen-reference DPO never touched — and still the reward stays at the marginal (≈0.5 → ≈0.6), mean contingency +0.03 / +0.03 / −0.00 across three schedules, best single seeds +0.23 and +0.22, 0/8 over the bar; policy-invariant on 6–8/8 seeds, ORG-B′ at exactly 0.000. Reinforcement finds the marginal and stops.</w:t>
       </w:r>
     </w:p>
     <w:p>
@@ -34121,7 +34121,7 @@
               <w:rPr>
                 <w:sz w:val="16"/>
               </w:rPr>
-              <w:t>−0.012</w:t>
+              <w:t>-0.010</w:t>
             </w:r>
           </w:p>
         </w:tc>
@@ -34138,7 +34138,7 @@
               <w:rPr>
                 <w:sz w:val="16"/>
               </w:rPr>
-              <w:t>0/4</w:t>
+              <w:t>0/8</w:t>
             </w:r>
           </w:p>
         </w:tc>
@@ -34155,7 +34155,7 @@
               <w:rPr>
                 <w:sz w:val="16"/>
               </w:rPr>
-              <w:t>2/4</w:t>
+              <w:t>5/8</w:t>
             </w:r>
           </w:p>
         </w:tc>
@@ -34172,7 +34172,7 @@
               <w:rPr>
                 <w:sz w:val="16"/>
               </w:rPr>
-              <w:t>0.665 / 0.677</w:t>
+              <w:t>0.690 / 0.699</w:t>
             </w:r>
           </w:p>
         </w:tc>
@@ -34223,7 +34223,7 @@
               <w:rPr>
                 <w:sz w:val="16"/>
               </w:rPr>
-              <w:t>0.987 / 1.036</w:t>
+              <w:t>0.997 / 1.016</w:t>
             </w:r>
           </w:p>
         </w:tc>
@@ -34310,7 +34310,7 @@
               <w:rPr>
                 <w:sz w:val="16"/>
               </w:rPr>
-              <w:t>+0.061</w:t>
+              <w:t>+0.025</w:t>
             </w:r>
           </w:p>
         </w:tc>
@@ -34327,7 +34327,7 @@
               <w:rPr>
                 <w:sz w:val="16"/>
               </w:rPr>
-              <w:t>0/4</w:t>
+              <w:t>0/8</w:t>
             </w:r>
           </w:p>
         </w:tc>
@@ -34344,7 +34344,7 @@
               <w:rPr>
                 <w:sz w:val="16"/>
               </w:rPr>
-              <w:t>4/4</w:t>
+              <w:t>6/8</w:t>
             </w:r>
           </w:p>
         </w:tc>
@@ -34361,7 +34361,7 @@
               <w:rPr>
                 <w:sz w:val="16"/>
               </w:rPr>
-              <w:t>0.846 / 0.785</w:t>
+              <w:t>0.902 / 0.876</w:t>
             </w:r>
           </w:p>
         </w:tc>
@@ -34378,7 +34378,7 @@
               <w:rPr>
                 <w:sz w:val="16"/>
               </w:rPr>
-              <w:t>0.53 → 0.63</w:t>
+              <w:t>0.54 → 0.63</w:t>
             </w:r>
           </w:p>
         </w:tc>
@@ -34395,7 +34395,7 @@
               <w:rPr>
                 <w:sz w:val="16"/>
               </w:rPr>
-              <w:t>0.05–0.08</w:t>
+              <w:t>0.02–0.08</w:t>
             </w:r>
           </w:p>
         </w:tc>
@@ -34412,7 +34412,7 @@
               <w:rPr>
                 <w:sz w:val="16"/>
               </w:rPr>
-              <w:t>0.966 / 0.989</w:t>
+              <w:t>0.977 / 1.007</w:t>
             </w:r>
           </w:p>
         </w:tc>
@@ -34499,7 +34499,7 @@
               <w:rPr>
                 <w:sz w:val="16"/>
               </w:rPr>
-              <w:t>+0.052</w:t>
+              <w:t>+0.027</w:t>
             </w:r>
           </w:p>
         </w:tc>
@@ -34516,7 +34516,7 @@
               <w:rPr>
                 <w:sz w:val="16"/>
               </w:rPr>
-              <w:t>0/4</w:t>
+              <w:t>0/8</w:t>
             </w:r>
           </w:p>
         </w:tc>
@@ -34533,7 +34533,7 @@
               <w:rPr>
                 <w:sz w:val="16"/>
               </w:rPr>
-              <w:t>4/4</w:t>
+              <w:t>8/8</w:t>
             </w:r>
           </w:p>
         </w:tc>
@@ -34550,7 +34550,7 @@
               <w:rPr>
                 <w:sz w:val="16"/>
               </w:rPr>
-              <w:t>0.920 / 0.868</w:t>
+              <w:t>0.945 / 0.919</w:t>
             </w:r>
           </w:p>
         </w:tc>
@@ -34567,7 +34567,7 @@
               <w:rPr>
                 <w:sz w:val="16"/>
               </w:rPr>
-              <w:t>0.48 → 0.58</w:t>
+              <w:t>0.52 → 0.59</w:t>
             </w:r>
           </w:p>
         </w:tc>
@@ -34584,7 +34584,7 @@
               <w:rPr>
                 <w:sz w:val="16"/>
               </w:rPr>
-              <w:t>0.02–0.08</w:t>
+              <w:t>0.02–0.16</w:t>
             </w:r>
           </w:p>
         </w:tc>
@@ -34601,7 +34601,7 @@
               <w:rPr>
                 <w:sz w:val="16"/>
               </w:rPr>
-              <w:t>1.011 / 0.984</w:t>
+              <w:t>1.004 / 1.024</w:t>
             </w:r>
           </w:p>
         </w:tc>
@@ -34688,7 +34688,7 @@
               <w:rPr>
                 <w:sz w:val="16"/>
               </w:rPr>
-              <w:t>+0.001</w:t>
+              <w:t>-0.002</w:t>
             </w:r>
           </w:p>
         </w:tc>
@@ -34705,7 +34705,7 @@
               <w:rPr>
                 <w:sz w:val="16"/>
               </w:rPr>
-              <w:t>0/4</w:t>
+              <w:t>0/8</w:t>
             </w:r>
           </w:p>
         </w:tc>
@@ -34722,7 +34722,7 @@
               <w:rPr>
                 <w:sz w:val="16"/>
               </w:rPr>
-              <w:t>4/4</w:t>
+              <w:t>7/8</w:t>
             </w:r>
           </w:p>
         </w:tc>
@@ -34739,7 +34739,7 @@
               <w:rPr>
                 <w:sz w:val="16"/>
               </w:rPr>
-              <w:t>0.736 / 0.735</w:t>
+              <w:t>0.741 / 0.743</w:t>
             </w:r>
           </w:p>
         </w:tc>
@@ -34756,7 +34756,7 @@
               <w:rPr>
                 <w:sz w:val="16"/>
               </w:rPr>
-              <w:t>0.54 → 0.60</w:t>
+              <w:t>0.54 → 0.58</w:t>
             </w:r>
           </w:p>
         </w:tc>
@@ -34790,7 +34790,7 @@
               <w:rPr>
                 <w:sz w:val="16"/>
               </w:rPr>
-              <w:t>0.982 / 0.959</w:t>
+              <w:t>1.041 / 0.987</w:t>
             </w:r>
           </w:p>
         </w:tc>
@@ -34827,7 +34827,7 @@
         <w:rPr>
           <w:sz w:val="20"/>
         </w:rPr>
-        <w:t xml:space="preserve">Per-seed ORG-B contingency: (seeds 4–7; seeds 0–3 rerunning at submission) rl_inject +0.23 / 0.00 / +0.01 / 0.00; rl_inject_t12 0.00 / −0.01 / 0.00 / +0.22; rl_inject_lr1e4 0.00 / −0.02 / 0.00 / +0.02. Reading: the reward is fully shaped (the injected exemplars make every group mixed, the negative advantage lands on the model's own wrong-class remarks), the optimiser moves (grad norms 0.5–3, anchor KL non-zero, generations drift toward repetitive fragments — "that one there looks there there"), and the class-match rate still sits at the marginal after 120 steps: the organism has no cheap access to the adjacency at the remark position, so it optimises the marginal instead. This is the same conclusion NAR02b reached from the other side — the recipe that installs the contingency (RL on the </w:t>
+        <w:t xml:space="preserve">Per-seed ORG-B contingency: (seeds 0–7) rl_inject +0.00 / -0.03 / -0.01 / +0.00 / +0.23 / +0.00 / +0.01 / +0.00; rl_inject_t12 +0.05 / -0.06 / +0.00 / +0.01 / +0.00 / -0.01 / +0.00 / +0.22; rl_inject_lr1e4 +0.00 / +0.00 / +0.00 / -0.02 / +0.00 / -0.02 / +0.00 / +0.02. Reading: the reward is fully shaped (the injected exemplars make every group mixed, the negative advantage lands on the model's own wrong-class remarks), the optimiser moves (grad norms 0.5–3, anchor KL non-zero, generations drift toward repetitive fragments — "that one there looks there there"), and the class-match rate still sits at the marginal after 120 steps: the organism has no cheap access to the adjacency at the remark position, so it optimises the marginal instead. This is the same conclusion NAR02b reached from the other side — the recipe that installs the contingency (RL on the </w:t>
       </w:r>
       <w:r>
         <w:rPr>
@@ -41595,7 +41595,7 @@
         <w:rPr>
           <w:sz w:val="20"/>
         </w:rPr>
-        <w:t>From 43 committed run manifests (2026-07-30 → 2026-08-14): 23.7 GPU-hours of job time, 16.9 GPU-busy hours, 24.7 rented box-hours (RTX PRO 6000 Blackwell 96–102 GB; molab sandboxes; replacement cost ≈ $17–86 at $0.70–3.50/h), 35 counted runs; redo tax 12–26%. Largest items: E16 v2 301 job-min (52 min wall over 6 shards, 5.79× at 96% parallel efficiency); SCL01 32B 108 min; E17 97 min; SCL01 14B 95 min. 53× parameters bought 1.53× runtime (0.6B 1.96 → 32B 3.00 min/organism): the workload is latency-bound, so a 14B map costs ~19% more than 4B, not 3.5×. Whole program ≈ 4×10¹⁸ FLOP. New for this report: NAR02 39.1, PAP01 12.1 and PAP02 10.3 GPU-minutes (RESULTS.md files, Appendix J). NAR02b 70.1, NAR03 116.5, NAR03b 161, NAR03c 118, NAR04 pilot 52 and NAR04b 93 GPU-minutes (Appendix J.3; NAR02b/NAR03 recovered from the sandbox volume after an operator-side power failure on 2026-08-16; a second sandbox loss on 2026-08-16 took NAR04b seeds 0–3 and two NAR04 pilot seeds, rerun where noted).</w:t>
+        <w:t>From 43 committed run manifests (2026-07-30 → 2026-08-14): 23.7 GPU-hours of job time, 16.9 GPU-busy hours, 24.7 rented box-hours (RTX PRO 6000 Blackwell 96–102 GB; molab sandboxes; replacement cost ≈ $17–86 at $0.70–3.50/h), 35 counted runs; redo tax 12–26%. Largest items: E16 v2 301 job-min (52 min wall over 6 shards, 5.79× at 96% parallel efficiency); SCL01 32B 108 min; E17 97 min; SCL01 14B 95 min. 53× parameters bought 1.53× runtime (0.6B 1.96 → 32B 3.00 min/organism): the workload is latency-bound, so a 14B map costs ~19% more than 4B, not 3.5×. Whole program ≈ 4×10¹⁸ FLOP. New for this report: NAR02 39.1, PAP01 12.1 and PAP02 10.3 GPU-minutes (RESULTS.md files, Appendix J). NAR02b 70.1, NAR03 116.5, NAR03b 161, NAR03c 118, NAR04 pilot 52 and NAR04b 187 GPU-minutes (Appendix J.3; NAR02b/NAR03 recovered from the sandbox volume after an operator-side power failure on 2026-08-16; a second sandbox loss on 2026-08-16 took NAR04b seeds 0–3 (rerun on the second box) and two NAR04 pilot seeds).</w:t>
       </w:r>
     </w:p>
     <w:p>

</xml_diff>